<commit_message>
fix(MFIX): atualização final com IA
</commit_message>
<xml_diff>
--- a/OFCMFIX.docx
+++ b/OFCMFIX.docx
@@ -2258,7 +2258,15 @@
               <w:t xml:space="preserve"> </w:t>
             </w:r>
             <w:r>
-              <w:t xml:space="preserve">Mart, ETL em SGBDs Relacionais, </w:t>
+              <w:t xml:space="preserve">Mart, ETL em </w:t>
+            </w:r>
+            <w:proofErr w:type="spellStart"/>
+            <w:r>
+              <w:t>SGBDs</w:t>
+            </w:r>
+            <w:proofErr w:type="spellEnd"/>
+            <w:r>
+              <w:t xml:space="preserve"> Relacionais, </w:t>
             </w:r>
           </w:p>
           <w:p>
@@ -3596,7 +3604,23 @@
           <w:rFonts w:ascii="Trebuchet MS" w:eastAsia="Trebuchet MS" w:hAnsi="Trebuchet MS" w:cs="Trebuchet MS"/>
           <w:color w:val="FFFF00"/>
         </w:rPr>
-        <w:t xml:space="preserve"> Planos de projeto, atas de reunião, relatórios de progresso, registros de riscos, análise SWOT, análise de mercado, etc.  </w:t>
+        <w:t xml:space="preserve"> Planos de projeto, atas de reunião, relatórios de progresso, registros de riscos, análise SWOT, análise de </w:t>
+      </w:r>
+      <w:proofErr w:type="gramStart"/>
+      <w:r>
+        <w:rPr>
+          <w:rFonts w:ascii="Trebuchet MS" w:eastAsia="Trebuchet MS" w:hAnsi="Trebuchet MS" w:cs="Trebuchet MS"/>
+          <w:color w:val="FFFF00"/>
+        </w:rPr>
+        <w:t>mercado, etc.</w:t>
+      </w:r>
+      <w:proofErr w:type="gramEnd"/>
+      <w:r>
+        <w:rPr>
+          <w:rFonts w:ascii="Trebuchet MS" w:eastAsia="Trebuchet MS" w:hAnsi="Trebuchet MS" w:cs="Trebuchet MS"/>
+          <w:color w:val="FFFF00"/>
+        </w:rPr>
+        <w:t xml:space="preserve">  </w:t>
       </w:r>
     </w:p>
     <w:p>
@@ -3621,7 +3645,23 @@
           <w:rFonts w:ascii="Trebuchet MS" w:eastAsia="Trebuchet MS" w:hAnsi="Trebuchet MS" w:cs="Trebuchet MS"/>
           <w:color w:val="FFFF00"/>
         </w:rPr>
-        <w:t xml:space="preserve"> Modelos de banco de dados, diagramas UML, diagramas de arquitetura, fluxos, organogramas, etc.  </w:t>
+        <w:t xml:space="preserve"> Modelos de banco de dados, diagramas UML, diagramas de arquitetura, fluxos, </w:t>
+      </w:r>
+      <w:proofErr w:type="gramStart"/>
+      <w:r>
+        <w:rPr>
+          <w:rFonts w:ascii="Trebuchet MS" w:eastAsia="Trebuchet MS" w:hAnsi="Trebuchet MS" w:cs="Trebuchet MS"/>
+          <w:color w:val="FFFF00"/>
+        </w:rPr>
+        <w:t>organogramas, etc.</w:t>
+      </w:r>
+      <w:proofErr w:type="gramEnd"/>
+      <w:r>
+        <w:rPr>
+          <w:rFonts w:ascii="Trebuchet MS" w:eastAsia="Trebuchet MS" w:hAnsi="Trebuchet MS" w:cs="Trebuchet MS"/>
+          <w:color w:val="FFFF00"/>
+        </w:rPr>
+        <w:t xml:space="preserve">  </w:t>
       </w:r>
     </w:p>
     <w:p>
@@ -3660,7 +3700,23 @@
           <w:rFonts w:ascii="Trebuchet MS" w:eastAsia="Trebuchet MS" w:hAnsi="Trebuchet MS" w:cs="Trebuchet MS"/>
           <w:color w:val="FFFF00"/>
         </w:rPr>
-        <w:t xml:space="preserve"> iniciais de produtos, etc.  </w:t>
+        <w:t xml:space="preserve"> iniciais de </w:t>
+      </w:r>
+      <w:proofErr w:type="gramStart"/>
+      <w:r>
+        <w:rPr>
+          <w:rFonts w:ascii="Trebuchet MS" w:eastAsia="Trebuchet MS" w:hAnsi="Trebuchet MS" w:cs="Trebuchet MS"/>
+          <w:color w:val="FFFF00"/>
+        </w:rPr>
+        <w:t>produtos, etc.</w:t>
+      </w:r>
+      <w:proofErr w:type="gramEnd"/>
+      <w:r>
+        <w:rPr>
+          <w:rFonts w:ascii="Trebuchet MS" w:eastAsia="Trebuchet MS" w:hAnsi="Trebuchet MS" w:cs="Trebuchet MS"/>
+          <w:color w:val="FFFF00"/>
+        </w:rPr>
+        <w:t xml:space="preserve">  </w:t>
       </w:r>
     </w:p>
     <w:p>
@@ -7466,13 +7522,13 @@
         <w:rPr>
           <w:rFonts w:ascii="Arial" w:hAnsi="Arial" w:cs="Arial"/>
           <w:b/>
-          <w:szCs w:val="22"/>
-        </w:rPr>
-      </w:pPr>
-      <w:r>
-        <w:rPr>
-          <w:rFonts w:ascii="Arial" w:hAnsi="Arial" w:cs="Arial"/>
-          <w:szCs w:val="22"/>
+          <w:sz w:val="24"/>
+        </w:rPr>
+      </w:pPr>
+      <w:r>
+        <w:rPr>
+          <w:rFonts w:ascii="Arial" w:hAnsi="Arial" w:cs="Arial"/>
+          <w:sz w:val="24"/>
         </w:rPr>
         <w:t xml:space="preserve">O presente Projeto Integrador tem como finalidade desenvolver uma solução informatizada voltada à gestão estratégica e operacional da empresa MFIX Fixadores, utilizando conceitos de Inteligência Competitiva, Estatística Inferencial, Banco de Dados, Inteligência Artificial e Desenvolvimento de Software como apoio à tomada de decisão organizacional. </w:t>
       </w:r>
@@ -7484,13 +7540,13 @@
         <w:jc w:val="both"/>
         <w:rPr>
           <w:rFonts w:ascii="Arial" w:hAnsi="Arial" w:cs="Arial"/>
-          <w:szCs w:val="22"/>
-        </w:rPr>
-      </w:pPr>
-      <w:r>
-        <w:rPr>
-          <w:rFonts w:ascii="Arial" w:hAnsi="Arial" w:cs="Arial"/>
-          <w:szCs w:val="22"/>
+          <w:sz w:val="24"/>
+        </w:rPr>
+      </w:pPr>
+      <w:r>
+        <w:rPr>
+          <w:rFonts w:ascii="Arial" w:hAnsi="Arial" w:cs="Arial"/>
+          <w:sz w:val="24"/>
         </w:rPr>
         <w:t xml:space="preserve">Em um cenário industrial cada vez mais competitivo, empresas do setor de fixadores e componentes industriais enfrentam desafios relacionados ao controle de estoque, movimentações de produtos, eficiência logística, rapidez nas entregas, análise de dados e adaptação às transformações tecnológicas. Nesse contexto, torna-se essencial a utilização de ferramentas capazes de integrar informações operacionais e estratégicas, permitindo maior controle das operações e suporte analítico à gestão empresarial. </w:t>
       </w:r>
@@ -7502,13 +7558,13 @@
         <w:jc w:val="both"/>
         <w:rPr>
           <w:rFonts w:ascii="Arial" w:hAnsi="Arial" w:cs="Arial"/>
-          <w:szCs w:val="22"/>
-        </w:rPr>
-      </w:pPr>
-      <w:r>
-        <w:rPr>
-          <w:rFonts w:ascii="Arial" w:hAnsi="Arial" w:cs="Arial"/>
-          <w:szCs w:val="22"/>
+          <w:sz w:val="24"/>
+        </w:rPr>
+      </w:pPr>
+      <w:r>
+        <w:rPr>
+          <w:rFonts w:ascii="Arial" w:hAnsi="Arial" w:cs="Arial"/>
+          <w:sz w:val="24"/>
         </w:rPr>
         <w:t xml:space="preserve">A Inteligência Competitiva permite transformar dados em conhecimento estratégico, auxiliando empresas na identificação de tendências, ameaças, oportunidades e melhorias organizacionais. Diante disso, o projeto busca desenvolver mecanismos de coleta, tratamento, armazenamento e análise de dados, apoiados por tecnologias como banco de dados relacional, processos ETL, Data Warehouse (DW), dashboards gerenciais e técnicas de inteligência artificial. </w:t>
       </w:r>
@@ -7520,13 +7576,13 @@
         <w:jc w:val="both"/>
         <w:rPr>
           <w:rFonts w:ascii="Arial" w:hAnsi="Arial" w:cs="Arial"/>
-          <w:szCs w:val="22"/>
-        </w:rPr>
-      </w:pPr>
-      <w:r>
-        <w:rPr>
-          <w:rFonts w:ascii="Arial" w:hAnsi="Arial" w:cs="Arial"/>
-          <w:szCs w:val="22"/>
+          <w:sz w:val="24"/>
+        </w:rPr>
+      </w:pPr>
+      <w:r>
+        <w:rPr>
+          <w:rFonts w:ascii="Arial" w:hAnsi="Arial" w:cs="Arial"/>
+          <w:sz w:val="24"/>
         </w:rPr>
         <w:t>A solução proposta contempla a construção de um ambiente integrado para controle de estoque e movimentações de produtos, permitindo acompanhar entradas e saídas de mercadorias, disponibilidade de itens, fluxo operacional e indicadores estratégicos da empresa. Além do suporte operacional, o sistema também busca melhorar a eficiência logística e o relacionamento com os clientes, permitindo maior controle sobre prazos de entrega, previsão de reposição de produtos e comunicação sobre disponibilidade de estoque.</w:t>
       </w:r>
@@ -7537,6 +7593,7 @@
       </w:pPr>
       <w:bookmarkStart w:id="1" w:name="_Toc231652342"/>
       <w:r>
+        <w:lastRenderedPageBreak/>
         <w:t>2. Posicionamento</w:t>
       </w:r>
       <w:bookmarkEnd w:id="1"/>
@@ -7551,13 +7608,13 @@
         <w:jc w:val="both"/>
         <w:rPr>
           <w:rFonts w:ascii="Arial" w:hAnsi="Arial" w:cs="Arial"/>
-          <w:szCs w:val="22"/>
-        </w:rPr>
-      </w:pPr>
-      <w:r>
-        <w:rPr>
-          <w:rFonts w:ascii="Arial" w:hAnsi="Arial" w:cs="Arial"/>
-          <w:szCs w:val="22"/>
+          <w:sz w:val="24"/>
+        </w:rPr>
+      </w:pPr>
+      <w:r>
+        <w:rPr>
+          <w:rFonts w:ascii="Arial" w:hAnsi="Arial" w:cs="Arial"/>
+          <w:sz w:val="24"/>
         </w:rPr>
         <w:t xml:space="preserve">A MFIX Fixadores atua em um setor industrial altamente competitivo e dependente de eficiência operacional, controle de estoque, qualidade logística e rapidez na tomada de decisão. A transformação digital no ambiente corporativo vem exigindo das empresas maior capacidade analítica, integração de sistemas e utilização inteligente de dados para otimização de processos e previsão de tendências de mercado. </w:t>
       </w:r>
@@ -7569,15 +7626,14 @@
         <w:jc w:val="both"/>
         <w:rPr>
           <w:rFonts w:ascii="Arial" w:hAnsi="Arial" w:cs="Arial"/>
-          <w:szCs w:val="22"/>
-        </w:rPr>
-      </w:pPr>
-      <w:r>
-        <w:rPr>
-          <w:rFonts w:ascii="Arial" w:hAnsi="Arial" w:cs="Arial"/>
-          <w:szCs w:val="22"/>
-        </w:rPr>
-        <w:lastRenderedPageBreak/>
+          <w:sz w:val="24"/>
+        </w:rPr>
+      </w:pPr>
+      <w:r>
+        <w:rPr>
+          <w:rFonts w:ascii="Arial" w:hAnsi="Arial" w:cs="Arial"/>
+          <w:sz w:val="24"/>
+        </w:rPr>
         <w:t>Nesse contexto, o projeto desenvolvido para a MFIX contempla a integração entre banco de dados relacional, processos ETL e um ambiente de Data Warehouse voltado à análise estratégica das informações corporativas. Além disso, foi desenvolvida uma interface integrada ao sistema contendo dashboards interativos responsáveis pela visualização dos indicadores e métricas estratégicas da empresa, com foco no monitoramento das movimentações de estoque, entradas e saídas de produtos, fluxo operacional e acompanhamento logístico.</w:t>
       </w:r>
     </w:p>
@@ -7588,13 +7644,13 @@
         <w:jc w:val="both"/>
         <w:rPr>
           <w:rFonts w:ascii="Arial" w:hAnsi="Arial" w:cs="Arial"/>
-          <w:szCs w:val="22"/>
-        </w:rPr>
-      </w:pPr>
-      <w:r>
-        <w:rPr>
-          <w:rFonts w:ascii="Arial" w:hAnsi="Arial" w:cs="Arial"/>
-          <w:szCs w:val="22"/>
+          <w:sz w:val="24"/>
+        </w:rPr>
+      </w:pPr>
+      <w:r>
+        <w:rPr>
+          <w:rFonts w:ascii="Arial" w:hAnsi="Arial" w:cs="Arial"/>
+          <w:sz w:val="24"/>
         </w:rPr>
         <w:t xml:space="preserve"> A solução também contribui para o relacionamento com os clientes, possibilitando melhor controle sobre disponibilidade de produtos, acompanhamento de pedidos e previsões de reposição de estoque.</w:t>
       </w:r>
@@ -7664,7 +7720,15 @@
           <w:rFonts w:ascii="Arial" w:hAnsi="Arial" w:cs="Arial"/>
           <w:szCs w:val="22"/>
         </w:rPr>
-        <w:t>Outro desafio importante está relacionado à necessidade de modernização tecnológica da organização, especialmente na utilização de ferramentas capazes de automatizar processos, integrar informações e fornecer maior precisão no gerenciamento de estoque e na análise de dados corporativos. Além dos impactos operacionais, a falta de controle eficiente sobre o estoque e as movimentações de produtos também afeta diretamente o relacionamento com os clientes. A ausência de informações atualizadas pode gerar atrasos em entregas, dificuldades na previsão de disponibilidade de produtos e falhas na comunicação sobre itens em falta ou prazos de reposição.</w:t>
+        <w:t xml:space="preserve">Outro desafio importante está relacionado à necessidade de modernização tecnológica da organização, especialmente na utilização de ferramentas capazes de automatizar processos, integrar informações e fornecer maior precisão no gerenciamento de estoque e na análise de dados corporativos. Além dos impactos operacionais, a falta de controle eficiente sobre o estoque e as movimentações de produtos também afeta diretamente o relacionamento com os clientes. A </w:t>
+      </w:r>
+      <w:r>
+        <w:rPr>
+          <w:rFonts w:ascii="Arial" w:hAnsi="Arial" w:cs="Arial"/>
+          <w:szCs w:val="22"/>
+        </w:rPr>
+        <w:lastRenderedPageBreak/>
+        <w:t>ausência de informações atualizadas pode gerar atrasos em entregas, dificuldades na previsão de disponibilidade de produtos e falhas na comunicação sobre itens em falta ou prazos de reposição.</w:t>
       </w:r>
     </w:p>
     <w:p>
@@ -7733,7 +7797,6 @@
         <w:rPr>
           <w:rStyle w:val="Forte"/>
         </w:rPr>
-        <w:lastRenderedPageBreak/>
         <w:t>Tabela 1 – Descrição do Problema</w:t>
       </w:r>
     </w:p>
@@ -8079,6 +8142,7 @@
       </w:pPr>
       <w:bookmarkStart w:id="3" w:name="_Toc231652344"/>
       <w:r>
+        <w:lastRenderedPageBreak/>
         <w:t>3.</w:t>
       </w:r>
       <w:r>
@@ -8125,15 +8189,7 @@
           <w:rFonts w:ascii="Arial" w:hAnsi="Arial" w:cs="Arial"/>
           <w:szCs w:val="22"/>
         </w:rPr>
-        <w:t xml:space="preserve">A solução permitirá monitoramento das entradas e saídas de produtos, controle logístico, rastreamento de movimentações e acompanhamento de indicadores estratégicos em tempo real. </w:t>
-      </w:r>
-      <w:r>
-        <w:rPr>
-          <w:rFonts w:ascii="Arial" w:hAnsi="Arial" w:cs="Arial"/>
-          <w:szCs w:val="22"/>
-        </w:rPr>
-        <w:lastRenderedPageBreak/>
-        <w:t>Além disso, o sistema contribuirá para automatização de processos internos, redução de falhas operacionais e melhoria da eficiência administrativa.</w:t>
+        <w:t>A solução permitirá monitoramento das entradas e saídas de produtos, controle logístico, rastreamento de movimentações e acompanhamento de indicadores estratégicos em tempo real. Além disso, o sistema contribuirá para automatização de processos internos, redução de falhas operacionais e melhoria da eficiência administrativa.</w:t>
       </w:r>
     </w:p>
     <w:p>
@@ -8441,6 +8497,7 @@
                 <w:szCs w:val="20"/>
               </w:rPr>
             </w:pPr>
+            <w:proofErr w:type="spellStart"/>
             <w:r>
               <w:rPr>
                 <w:rFonts w:ascii="Arial" w:eastAsia="MS Mincho" w:hAnsi="Arial" w:cs="Arial"/>
@@ -8449,19 +8506,10 @@
                 <w:sz w:val="20"/>
                 <w:szCs w:val="20"/>
               </w:rPr>
-              <w:t>Requisito Funcional</w:t>
-            </w:r>
-          </w:p>
-        </w:tc>
-        <w:tc>
-          <w:tcPr>
-            <w:tcW w:w="2549" w:type="pct"/>
-            <w:vAlign w:val="center"/>
-          </w:tcPr>
-          <w:p>
-            <w:pPr>
-              <w:spacing w:after="200" w:line="240" w:lineRule="auto"/>
-              <w:jc w:val="center"/>
+              <w:t>Requisito</w:t>
+            </w:r>
+            <w:proofErr w:type="spellEnd"/>
+            <w:r>
               <w:rPr>
                 <w:rFonts w:ascii="Arial" w:eastAsia="MS Mincho" w:hAnsi="Arial" w:cs="Arial"/>
                 <w:b/>
@@ -8469,7 +8517,9 @@
                 <w:sz w:val="20"/>
                 <w:szCs w:val="20"/>
               </w:rPr>
-            </w:pPr>
+              <w:t xml:space="preserve"> </w:t>
+            </w:r>
+            <w:proofErr w:type="spellStart"/>
             <w:r>
               <w:rPr>
                 <w:rFonts w:ascii="Arial" w:eastAsia="MS Mincho" w:hAnsi="Arial" w:cs="Arial"/>
@@ -8478,8 +8528,40 @@
                 <w:sz w:val="20"/>
                 <w:szCs w:val="20"/>
               </w:rPr>
+              <w:t>Funcional</w:t>
+            </w:r>
+            <w:proofErr w:type="spellEnd"/>
+          </w:p>
+        </w:tc>
+        <w:tc>
+          <w:tcPr>
+            <w:tcW w:w="2549" w:type="pct"/>
+            <w:vAlign w:val="center"/>
+          </w:tcPr>
+          <w:p>
+            <w:pPr>
+              <w:spacing w:after="200" w:line="240" w:lineRule="auto"/>
+              <w:jc w:val="center"/>
+              <w:rPr>
+                <w:rFonts w:ascii="Arial" w:eastAsia="MS Mincho" w:hAnsi="Arial" w:cs="Arial"/>
+                <w:b/>
+                <w:bCs/>
+                <w:sz w:val="20"/>
+                <w:szCs w:val="20"/>
+              </w:rPr>
+            </w:pPr>
+            <w:proofErr w:type="spellStart"/>
+            <w:r>
+              <w:rPr>
+                <w:rFonts w:ascii="Arial" w:eastAsia="MS Mincho" w:hAnsi="Arial" w:cs="Arial"/>
+                <w:b/>
+                <w:bCs/>
+                <w:sz w:val="20"/>
+                <w:szCs w:val="20"/>
+              </w:rPr>
               <w:t>Objetivo</w:t>
             </w:r>
+            <w:proofErr w:type="spellEnd"/>
           </w:p>
         </w:tc>
       </w:tr>
@@ -8525,14 +8607,34 @@
                 <w:szCs w:val="20"/>
               </w:rPr>
             </w:pPr>
+            <w:proofErr w:type="spellStart"/>
             <w:r>
               <w:rPr>
                 <w:rFonts w:ascii="Arial" w:eastAsia="MS Mincho" w:hAnsi="Arial" w:cs="Arial"/>
                 <w:sz w:val="20"/>
                 <w:szCs w:val="20"/>
               </w:rPr>
-              <w:t>Cadastrar produtos</w:t>
-            </w:r>
+              <w:t>Cadastrar</w:t>
+            </w:r>
+            <w:proofErr w:type="spellEnd"/>
+            <w:r>
+              <w:rPr>
+                <w:rFonts w:ascii="Arial" w:eastAsia="MS Mincho" w:hAnsi="Arial" w:cs="Arial"/>
+                <w:sz w:val="20"/>
+                <w:szCs w:val="20"/>
+              </w:rPr>
+              <w:t xml:space="preserve"> </w:t>
+            </w:r>
+            <w:proofErr w:type="spellStart"/>
+            <w:r>
+              <w:rPr>
+                <w:rFonts w:ascii="Arial" w:eastAsia="MS Mincho" w:hAnsi="Arial" w:cs="Arial"/>
+                <w:sz w:val="20"/>
+                <w:szCs w:val="20"/>
+              </w:rPr>
+              <w:t>produtos</w:t>
+            </w:r>
+            <w:proofErr w:type="spellEnd"/>
           </w:p>
         </w:tc>
         <w:tc>
@@ -8604,13 +8706,23 @@
                 <w:szCs w:val="20"/>
               </w:rPr>
             </w:pPr>
+            <w:proofErr w:type="spellStart"/>
             <w:r>
               <w:rPr>
                 <w:rFonts w:ascii="Arial" w:eastAsia="MS Mincho" w:hAnsi="Arial" w:cs="Arial"/>
                 <w:sz w:val="20"/>
                 <w:szCs w:val="20"/>
               </w:rPr>
-              <w:t>Controlar entradas de estoque</w:t>
+              <w:t>Controlar</w:t>
+            </w:r>
+            <w:proofErr w:type="spellEnd"/>
+            <w:r>
+              <w:rPr>
+                <w:rFonts w:ascii="Arial" w:eastAsia="MS Mincho" w:hAnsi="Arial" w:cs="Arial"/>
+                <w:sz w:val="20"/>
+                <w:szCs w:val="20"/>
+              </w:rPr>
+              <w:t xml:space="preserve"> entradas de estoque</w:t>
             </w:r>
           </w:p>
         </w:tc>
@@ -8634,7 +8746,25 @@
                 <w:sz w:val="20"/>
                 <w:szCs w:val="20"/>
               </w:rPr>
-              <w:t>Registrar movimentações de entrada</w:t>
+              <w:t xml:space="preserve">Registrar </w:t>
+            </w:r>
+            <w:proofErr w:type="spellStart"/>
+            <w:r>
+              <w:rPr>
+                <w:rFonts w:ascii="Arial" w:eastAsia="MS Mincho" w:hAnsi="Arial" w:cs="Arial"/>
+                <w:sz w:val="20"/>
+                <w:szCs w:val="20"/>
+              </w:rPr>
+              <w:t>movimentações</w:t>
+            </w:r>
+            <w:proofErr w:type="spellEnd"/>
+            <w:r>
+              <w:rPr>
+                <w:rFonts w:ascii="Arial" w:eastAsia="MS Mincho" w:hAnsi="Arial" w:cs="Arial"/>
+                <w:sz w:val="20"/>
+                <w:szCs w:val="20"/>
+              </w:rPr>
+              <w:t xml:space="preserve"> de entrada</w:t>
             </w:r>
           </w:p>
         </w:tc>
@@ -8663,6 +8793,7 @@
                 <w:sz w:val="20"/>
                 <w:szCs w:val="20"/>
               </w:rPr>
+              <w:lastRenderedPageBreak/>
               <w:t>RF03</w:t>
             </w:r>
           </w:p>
@@ -8681,13 +8812,41 @@
                 <w:szCs w:val="20"/>
               </w:rPr>
             </w:pPr>
+            <w:proofErr w:type="spellStart"/>
             <w:r>
               <w:rPr>
                 <w:rFonts w:ascii="Arial" w:eastAsia="MS Mincho" w:hAnsi="Arial" w:cs="Arial"/>
                 <w:sz w:val="20"/>
                 <w:szCs w:val="20"/>
               </w:rPr>
-              <w:t>Controlar saídas de estoque</w:t>
+              <w:t>Controlar</w:t>
+            </w:r>
+            <w:proofErr w:type="spellEnd"/>
+            <w:r>
+              <w:rPr>
+                <w:rFonts w:ascii="Arial" w:eastAsia="MS Mincho" w:hAnsi="Arial" w:cs="Arial"/>
+                <w:sz w:val="20"/>
+                <w:szCs w:val="20"/>
+              </w:rPr>
+              <w:t xml:space="preserve"> </w:t>
+            </w:r>
+            <w:proofErr w:type="spellStart"/>
+            <w:r>
+              <w:rPr>
+                <w:rFonts w:ascii="Arial" w:eastAsia="MS Mincho" w:hAnsi="Arial" w:cs="Arial"/>
+                <w:sz w:val="20"/>
+                <w:szCs w:val="20"/>
+              </w:rPr>
+              <w:t>saídas</w:t>
+            </w:r>
+            <w:proofErr w:type="spellEnd"/>
+            <w:r>
+              <w:rPr>
+                <w:rFonts w:ascii="Arial" w:eastAsia="MS Mincho" w:hAnsi="Arial" w:cs="Arial"/>
+                <w:sz w:val="20"/>
+                <w:szCs w:val="20"/>
+              </w:rPr>
+              <w:t xml:space="preserve"> de estoque</w:t>
             </w:r>
           </w:p>
         </w:tc>
@@ -8711,8 +8870,36 @@
                 <w:sz w:val="20"/>
                 <w:szCs w:val="20"/>
               </w:rPr>
-              <w:t>Registrar movimentações de saída</w:t>
-            </w:r>
+              <w:t xml:space="preserve">Registrar </w:t>
+            </w:r>
+            <w:proofErr w:type="spellStart"/>
+            <w:r>
+              <w:rPr>
+                <w:rFonts w:ascii="Arial" w:eastAsia="MS Mincho" w:hAnsi="Arial" w:cs="Arial"/>
+                <w:sz w:val="20"/>
+                <w:szCs w:val="20"/>
+              </w:rPr>
+              <w:t>movimentações</w:t>
+            </w:r>
+            <w:proofErr w:type="spellEnd"/>
+            <w:r>
+              <w:rPr>
+                <w:rFonts w:ascii="Arial" w:eastAsia="MS Mincho" w:hAnsi="Arial" w:cs="Arial"/>
+                <w:sz w:val="20"/>
+                <w:szCs w:val="20"/>
+              </w:rPr>
+              <w:t xml:space="preserve"> de </w:t>
+            </w:r>
+            <w:proofErr w:type="spellStart"/>
+            <w:r>
+              <w:rPr>
+                <w:rFonts w:ascii="Arial" w:eastAsia="MS Mincho" w:hAnsi="Arial" w:cs="Arial"/>
+                <w:sz w:val="20"/>
+                <w:szCs w:val="20"/>
+              </w:rPr>
+              <w:t>saída</w:t>
+            </w:r>
+            <w:proofErr w:type="spellEnd"/>
           </w:p>
         </w:tc>
       </w:tr>
@@ -8758,14 +8945,34 @@
                 <w:szCs w:val="20"/>
               </w:rPr>
             </w:pPr>
+            <w:proofErr w:type="spellStart"/>
             <w:r>
               <w:rPr>
                 <w:rFonts w:ascii="Arial" w:eastAsia="MS Mincho" w:hAnsi="Arial" w:cs="Arial"/>
                 <w:sz w:val="20"/>
                 <w:szCs w:val="20"/>
               </w:rPr>
-              <w:t>Consultar disponibilidade</w:t>
-            </w:r>
+              <w:t>Consultar</w:t>
+            </w:r>
+            <w:proofErr w:type="spellEnd"/>
+            <w:r>
+              <w:rPr>
+                <w:rFonts w:ascii="Arial" w:eastAsia="MS Mincho" w:hAnsi="Arial" w:cs="Arial"/>
+                <w:sz w:val="20"/>
+                <w:szCs w:val="20"/>
+              </w:rPr>
+              <w:t xml:space="preserve"> </w:t>
+            </w:r>
+            <w:proofErr w:type="spellStart"/>
+            <w:r>
+              <w:rPr>
+                <w:rFonts w:ascii="Arial" w:eastAsia="MS Mincho" w:hAnsi="Arial" w:cs="Arial"/>
+                <w:sz w:val="20"/>
+                <w:szCs w:val="20"/>
+              </w:rPr>
+              <w:t>disponibilidade</w:t>
+            </w:r>
+            <w:proofErr w:type="spellEnd"/>
           </w:p>
         </w:tc>
         <w:tc>
@@ -8782,14 +8989,52 @@
                 <w:szCs w:val="20"/>
               </w:rPr>
             </w:pPr>
+            <w:proofErr w:type="spellStart"/>
             <w:r>
               <w:rPr>
                 <w:rFonts w:ascii="Arial" w:eastAsia="MS Mincho" w:hAnsi="Arial" w:cs="Arial"/>
                 <w:sz w:val="20"/>
                 <w:szCs w:val="20"/>
               </w:rPr>
-              <w:t>Visualizar saldo dos produtos</w:t>
-            </w:r>
+              <w:t>Visualizar</w:t>
+            </w:r>
+            <w:proofErr w:type="spellEnd"/>
+            <w:r>
+              <w:rPr>
+                <w:rFonts w:ascii="Arial" w:eastAsia="MS Mincho" w:hAnsi="Arial" w:cs="Arial"/>
+                <w:sz w:val="20"/>
+                <w:szCs w:val="20"/>
+              </w:rPr>
+              <w:t xml:space="preserve"> </w:t>
+            </w:r>
+            <w:proofErr w:type="spellStart"/>
+            <w:r>
+              <w:rPr>
+                <w:rFonts w:ascii="Arial" w:eastAsia="MS Mincho" w:hAnsi="Arial" w:cs="Arial"/>
+                <w:sz w:val="20"/>
+                <w:szCs w:val="20"/>
+              </w:rPr>
+              <w:t>saldo</w:t>
+            </w:r>
+            <w:proofErr w:type="spellEnd"/>
+            <w:r>
+              <w:rPr>
+                <w:rFonts w:ascii="Arial" w:eastAsia="MS Mincho" w:hAnsi="Arial" w:cs="Arial"/>
+                <w:sz w:val="20"/>
+                <w:szCs w:val="20"/>
+              </w:rPr>
+              <w:t xml:space="preserve"> dos </w:t>
+            </w:r>
+            <w:proofErr w:type="spellStart"/>
+            <w:r>
+              <w:rPr>
+                <w:rFonts w:ascii="Arial" w:eastAsia="MS Mincho" w:hAnsi="Arial" w:cs="Arial"/>
+                <w:sz w:val="20"/>
+                <w:szCs w:val="20"/>
+              </w:rPr>
+              <w:t>produtos</w:t>
+            </w:r>
+            <w:proofErr w:type="spellEnd"/>
           </w:p>
         </w:tc>
       </w:tr>
@@ -8841,8 +9086,36 @@
                 <w:sz w:val="20"/>
                 <w:szCs w:val="20"/>
               </w:rPr>
-              <w:t>Gerar relatórios gerenciais</w:t>
-            </w:r>
+              <w:t xml:space="preserve">Gerar </w:t>
+            </w:r>
+            <w:proofErr w:type="spellStart"/>
+            <w:r>
+              <w:rPr>
+                <w:rFonts w:ascii="Arial" w:eastAsia="MS Mincho" w:hAnsi="Arial" w:cs="Arial"/>
+                <w:sz w:val="20"/>
+                <w:szCs w:val="20"/>
+              </w:rPr>
+              <w:t>relatórios</w:t>
+            </w:r>
+            <w:proofErr w:type="spellEnd"/>
+            <w:r>
+              <w:rPr>
+                <w:rFonts w:ascii="Arial" w:eastAsia="MS Mincho" w:hAnsi="Arial" w:cs="Arial"/>
+                <w:sz w:val="20"/>
+                <w:szCs w:val="20"/>
+              </w:rPr>
+              <w:t xml:space="preserve"> </w:t>
+            </w:r>
+            <w:proofErr w:type="spellStart"/>
+            <w:r>
+              <w:rPr>
+                <w:rFonts w:ascii="Arial" w:eastAsia="MS Mincho" w:hAnsi="Arial" w:cs="Arial"/>
+                <w:sz w:val="20"/>
+                <w:szCs w:val="20"/>
+              </w:rPr>
+              <w:t>gerenciais</w:t>
+            </w:r>
+            <w:proofErr w:type="spellEnd"/>
           </w:p>
         </w:tc>
         <w:tc>
@@ -8865,8 +9138,36 @@
                 <w:sz w:val="20"/>
                 <w:szCs w:val="20"/>
               </w:rPr>
-              <w:t>Auxiliar análise administrativa</w:t>
-            </w:r>
+              <w:t xml:space="preserve">Auxiliar </w:t>
+            </w:r>
+            <w:proofErr w:type="spellStart"/>
+            <w:r>
+              <w:rPr>
+                <w:rFonts w:ascii="Arial" w:eastAsia="MS Mincho" w:hAnsi="Arial" w:cs="Arial"/>
+                <w:sz w:val="20"/>
+                <w:szCs w:val="20"/>
+              </w:rPr>
+              <w:t>análise</w:t>
+            </w:r>
+            <w:proofErr w:type="spellEnd"/>
+            <w:r>
+              <w:rPr>
+                <w:rFonts w:ascii="Arial" w:eastAsia="MS Mincho" w:hAnsi="Arial" w:cs="Arial"/>
+                <w:sz w:val="20"/>
+                <w:szCs w:val="20"/>
+              </w:rPr>
+              <w:t xml:space="preserve"> </w:t>
+            </w:r>
+            <w:proofErr w:type="spellStart"/>
+            <w:r>
+              <w:rPr>
+                <w:rFonts w:ascii="Arial" w:eastAsia="MS Mincho" w:hAnsi="Arial" w:cs="Arial"/>
+                <w:sz w:val="20"/>
+                <w:szCs w:val="20"/>
+              </w:rPr>
+              <w:t>administrativa</w:t>
+            </w:r>
+            <w:proofErr w:type="spellEnd"/>
           </w:p>
         </w:tc>
       </w:tr>
@@ -8912,13 +9213,23 @@
                 <w:szCs w:val="20"/>
               </w:rPr>
             </w:pPr>
+            <w:proofErr w:type="spellStart"/>
             <w:r>
               <w:rPr>
                 <w:rFonts w:ascii="Arial" w:eastAsia="MS Mincho" w:hAnsi="Arial" w:cs="Arial"/>
                 <w:sz w:val="20"/>
                 <w:szCs w:val="20"/>
               </w:rPr>
-              <w:t>Visualizar dashboards</w:t>
+              <w:t>Visualizar</w:t>
+            </w:r>
+            <w:proofErr w:type="spellEnd"/>
+            <w:r>
+              <w:rPr>
+                <w:rFonts w:ascii="Arial" w:eastAsia="MS Mincho" w:hAnsi="Arial" w:cs="Arial"/>
+                <w:sz w:val="20"/>
+                <w:szCs w:val="20"/>
+              </w:rPr>
+              <w:t xml:space="preserve"> dashboards</w:t>
             </w:r>
           </w:p>
         </w:tc>
@@ -8936,14 +9247,52 @@
                 <w:szCs w:val="20"/>
               </w:rPr>
             </w:pPr>
+            <w:proofErr w:type="spellStart"/>
             <w:r>
               <w:rPr>
                 <w:rFonts w:ascii="Arial" w:eastAsia="MS Mincho" w:hAnsi="Arial" w:cs="Arial"/>
                 <w:sz w:val="20"/>
                 <w:szCs w:val="20"/>
               </w:rPr>
-              <w:t>Monitorar indicadores estratégicos</w:t>
-            </w:r>
+              <w:t>Monitorar</w:t>
+            </w:r>
+            <w:proofErr w:type="spellEnd"/>
+            <w:r>
+              <w:rPr>
+                <w:rFonts w:ascii="Arial" w:eastAsia="MS Mincho" w:hAnsi="Arial" w:cs="Arial"/>
+                <w:sz w:val="20"/>
+                <w:szCs w:val="20"/>
+              </w:rPr>
+              <w:t xml:space="preserve"> </w:t>
+            </w:r>
+            <w:proofErr w:type="spellStart"/>
+            <w:r>
+              <w:rPr>
+                <w:rFonts w:ascii="Arial" w:eastAsia="MS Mincho" w:hAnsi="Arial" w:cs="Arial"/>
+                <w:sz w:val="20"/>
+                <w:szCs w:val="20"/>
+              </w:rPr>
+              <w:t>indicadores</w:t>
+            </w:r>
+            <w:proofErr w:type="spellEnd"/>
+            <w:r>
+              <w:rPr>
+                <w:rFonts w:ascii="Arial" w:eastAsia="MS Mincho" w:hAnsi="Arial" w:cs="Arial"/>
+                <w:sz w:val="20"/>
+                <w:szCs w:val="20"/>
+              </w:rPr>
+              <w:t xml:space="preserve"> </w:t>
+            </w:r>
+            <w:proofErr w:type="spellStart"/>
+            <w:r>
+              <w:rPr>
+                <w:rFonts w:ascii="Arial" w:eastAsia="MS Mincho" w:hAnsi="Arial" w:cs="Arial"/>
+                <w:sz w:val="20"/>
+                <w:szCs w:val="20"/>
+              </w:rPr>
+              <w:t>estratégicos</w:t>
+            </w:r>
+            <w:proofErr w:type="spellEnd"/>
           </w:p>
         </w:tc>
       </w:tr>
@@ -8989,13 +9338,41 @@
                 <w:szCs w:val="20"/>
               </w:rPr>
             </w:pPr>
+            <w:proofErr w:type="spellStart"/>
             <w:r>
               <w:rPr>
                 <w:rFonts w:ascii="Arial" w:eastAsia="MS Mincho" w:hAnsi="Arial" w:cs="Arial"/>
                 <w:sz w:val="20"/>
                 <w:szCs w:val="20"/>
               </w:rPr>
-              <w:t>Executar processos ETL</w:t>
+              <w:t>Executar</w:t>
+            </w:r>
+            <w:proofErr w:type="spellEnd"/>
+            <w:r>
+              <w:rPr>
+                <w:rFonts w:ascii="Arial" w:eastAsia="MS Mincho" w:hAnsi="Arial" w:cs="Arial"/>
+                <w:sz w:val="20"/>
+                <w:szCs w:val="20"/>
+              </w:rPr>
+              <w:t xml:space="preserve"> </w:t>
+            </w:r>
+            <w:proofErr w:type="spellStart"/>
+            <w:r>
+              <w:rPr>
+                <w:rFonts w:ascii="Arial" w:eastAsia="MS Mincho" w:hAnsi="Arial" w:cs="Arial"/>
+                <w:sz w:val="20"/>
+                <w:szCs w:val="20"/>
+              </w:rPr>
+              <w:t>processos</w:t>
+            </w:r>
+            <w:proofErr w:type="spellEnd"/>
+            <w:r>
+              <w:rPr>
+                <w:rFonts w:ascii="Arial" w:eastAsia="MS Mincho" w:hAnsi="Arial" w:cs="Arial"/>
+                <w:sz w:val="20"/>
+                <w:szCs w:val="20"/>
+              </w:rPr>
+              <w:t xml:space="preserve"> ETL</w:t>
             </w:r>
           </w:p>
         </w:tc>
@@ -9013,13 +9390,41 @@
                 <w:szCs w:val="20"/>
               </w:rPr>
             </w:pPr>
+            <w:proofErr w:type="spellStart"/>
             <w:r>
               <w:rPr>
                 <w:rFonts w:ascii="Arial" w:eastAsia="MS Mincho" w:hAnsi="Arial" w:cs="Arial"/>
                 <w:sz w:val="20"/>
                 <w:szCs w:val="20"/>
               </w:rPr>
-              <w:t>Automatizar integração de dados</w:t>
+              <w:t>Automatizar</w:t>
+            </w:r>
+            <w:proofErr w:type="spellEnd"/>
+            <w:r>
+              <w:rPr>
+                <w:rFonts w:ascii="Arial" w:eastAsia="MS Mincho" w:hAnsi="Arial" w:cs="Arial"/>
+                <w:sz w:val="20"/>
+                <w:szCs w:val="20"/>
+              </w:rPr>
+              <w:t xml:space="preserve"> </w:t>
+            </w:r>
+            <w:proofErr w:type="spellStart"/>
+            <w:r>
+              <w:rPr>
+                <w:rFonts w:ascii="Arial" w:eastAsia="MS Mincho" w:hAnsi="Arial" w:cs="Arial"/>
+                <w:sz w:val="20"/>
+                <w:szCs w:val="20"/>
+              </w:rPr>
+              <w:t>integração</w:t>
+            </w:r>
+            <w:proofErr w:type="spellEnd"/>
+            <w:r>
+              <w:rPr>
+                <w:rFonts w:ascii="Arial" w:eastAsia="MS Mincho" w:hAnsi="Arial" w:cs="Arial"/>
+                <w:sz w:val="20"/>
+                <w:szCs w:val="20"/>
+              </w:rPr>
+              <w:t xml:space="preserve"> de dados</w:t>
             </w:r>
           </w:p>
         </w:tc>
@@ -9066,13 +9471,23 @@
                 <w:szCs w:val="20"/>
               </w:rPr>
             </w:pPr>
+            <w:proofErr w:type="spellStart"/>
             <w:r>
               <w:rPr>
                 <w:rFonts w:ascii="Arial" w:eastAsia="MS Mincho" w:hAnsi="Arial" w:cs="Arial"/>
                 <w:sz w:val="20"/>
                 <w:szCs w:val="20"/>
               </w:rPr>
-              <w:t>Integrar Data Warehouse</w:t>
+              <w:t>Integrar</w:t>
+            </w:r>
+            <w:proofErr w:type="spellEnd"/>
+            <w:r>
+              <w:rPr>
+                <w:rFonts w:ascii="Arial" w:eastAsia="MS Mincho" w:hAnsi="Arial" w:cs="Arial"/>
+                <w:sz w:val="20"/>
+                <w:szCs w:val="20"/>
+              </w:rPr>
+              <w:t xml:space="preserve"> Data Warehouse</w:t>
             </w:r>
           </w:p>
         </w:tc>
@@ -9090,14 +9505,52 @@
                 <w:szCs w:val="20"/>
               </w:rPr>
             </w:pPr>
+            <w:proofErr w:type="spellStart"/>
             <w:r>
               <w:rPr>
                 <w:rFonts w:ascii="Arial" w:eastAsia="MS Mincho" w:hAnsi="Arial" w:cs="Arial"/>
                 <w:sz w:val="20"/>
                 <w:szCs w:val="20"/>
               </w:rPr>
-              <w:t>Centralizar informações analíticas</w:t>
-            </w:r>
+              <w:t>Centralizar</w:t>
+            </w:r>
+            <w:proofErr w:type="spellEnd"/>
+            <w:r>
+              <w:rPr>
+                <w:rFonts w:ascii="Arial" w:eastAsia="MS Mincho" w:hAnsi="Arial" w:cs="Arial"/>
+                <w:sz w:val="20"/>
+                <w:szCs w:val="20"/>
+              </w:rPr>
+              <w:t xml:space="preserve"> </w:t>
+            </w:r>
+            <w:proofErr w:type="spellStart"/>
+            <w:r>
+              <w:rPr>
+                <w:rFonts w:ascii="Arial" w:eastAsia="MS Mincho" w:hAnsi="Arial" w:cs="Arial"/>
+                <w:sz w:val="20"/>
+                <w:szCs w:val="20"/>
+              </w:rPr>
+              <w:t>informações</w:t>
+            </w:r>
+            <w:proofErr w:type="spellEnd"/>
+            <w:r>
+              <w:rPr>
+                <w:rFonts w:ascii="Arial" w:eastAsia="MS Mincho" w:hAnsi="Arial" w:cs="Arial"/>
+                <w:sz w:val="20"/>
+                <w:szCs w:val="20"/>
+              </w:rPr>
+              <w:t xml:space="preserve"> </w:t>
+            </w:r>
+            <w:proofErr w:type="spellStart"/>
+            <w:r>
+              <w:rPr>
+                <w:rFonts w:ascii="Arial" w:eastAsia="MS Mincho" w:hAnsi="Arial" w:cs="Arial"/>
+                <w:sz w:val="20"/>
+                <w:szCs w:val="20"/>
+              </w:rPr>
+              <w:t>analíticas</w:t>
+            </w:r>
+            <w:proofErr w:type="spellEnd"/>
           </w:p>
         </w:tc>
       </w:tr>
@@ -9135,7 +9588,6 @@
         <w:rPr>
           <w:rStyle w:val="Forte"/>
         </w:rPr>
-        <w:lastRenderedPageBreak/>
         <w:t>Tabela X – Planejamento de Sprints</w:t>
       </w:r>
     </w:p>
@@ -9198,6 +9650,7 @@
                 <w:szCs w:val="20"/>
               </w:rPr>
             </w:pPr>
+            <w:proofErr w:type="spellStart"/>
             <w:r>
               <w:rPr>
                 <w:rFonts w:ascii="Arial" w:eastAsia="MS Mincho" w:hAnsi="Arial" w:cs="Arial"/>
@@ -9208,6 +9661,7 @@
               </w:rPr>
               <w:t>Entregas</w:t>
             </w:r>
+            <w:proofErr w:type="spellEnd"/>
           </w:p>
         </w:tc>
       </w:tr>
@@ -9486,6 +9940,7 @@
           <w:noProof/>
           <w:color w:val="0033CC"/>
         </w:rPr>
+        <w:lastRenderedPageBreak/>
         <w:drawing>
           <wp:inline distT="0" distB="0" distL="0" distR="0" wp14:anchorId="1A8AFE69" wp14:editId="5E69B787">
             <wp:extent cx="3390900" cy="3840480"/>
@@ -9572,7 +10027,6 @@
                 <w:b/>
                 <w:sz w:val="20"/>
               </w:rPr>
-              <w:lastRenderedPageBreak/>
               <w:t xml:space="preserve">Disciplina </w:t>
             </w:r>
           </w:p>
@@ -9640,6 +10094,7 @@
                 <w:b/>
                 <w:sz w:val="20"/>
               </w:rPr>
+              <w:lastRenderedPageBreak/>
               <w:t xml:space="preserve">Objetivos </w:t>
             </w:r>
           </w:p>
@@ -9861,7 +10316,53 @@
                 <w:b/>
                 <w:sz w:val="20"/>
               </w:rPr>
-              <w:t>Ambiental, desenvolva uma análise utilizando-se de ferramentas de Inteligência Artificial (ChatGPT, Gemini, Copilot, DeepSeek, etc...) para apoiar a tomada de decisão do Projeto Integrador III que contemple:</w:t>
+              <w:t xml:space="preserve">Ambiental, desenvolva uma análise utilizando-se de ferramentas de Inteligência Artificial (ChatGPT, Gemini, </w:t>
+            </w:r>
+            <w:proofErr w:type="spellStart"/>
+            <w:r>
+              <w:rPr>
+                <w:rFonts w:ascii="Arial" w:eastAsia="Arial" w:hAnsi="Arial" w:cs="Arial"/>
+                <w:b/>
+                <w:sz w:val="20"/>
+              </w:rPr>
+              <w:t>Copilot</w:t>
+            </w:r>
+            <w:proofErr w:type="spellEnd"/>
+            <w:r>
+              <w:rPr>
+                <w:rFonts w:ascii="Arial" w:eastAsia="Arial" w:hAnsi="Arial" w:cs="Arial"/>
+                <w:b/>
+                <w:sz w:val="20"/>
+              </w:rPr>
+              <w:t xml:space="preserve">, </w:t>
+            </w:r>
+            <w:proofErr w:type="spellStart"/>
+            <w:proofErr w:type="gramStart"/>
+            <w:r>
+              <w:rPr>
+                <w:rFonts w:ascii="Arial" w:eastAsia="Arial" w:hAnsi="Arial" w:cs="Arial"/>
+                <w:b/>
+                <w:sz w:val="20"/>
+              </w:rPr>
+              <w:t>DeepSeek</w:t>
+            </w:r>
+            <w:proofErr w:type="spellEnd"/>
+            <w:r>
+              <w:rPr>
+                <w:rFonts w:ascii="Arial" w:eastAsia="Arial" w:hAnsi="Arial" w:cs="Arial"/>
+                <w:b/>
+                <w:sz w:val="20"/>
+              </w:rPr>
+              <w:t>, etc...</w:t>
+            </w:r>
+            <w:proofErr w:type="gramEnd"/>
+            <w:r>
+              <w:rPr>
+                <w:rFonts w:ascii="Arial" w:eastAsia="Arial" w:hAnsi="Arial" w:cs="Arial"/>
+                <w:b/>
+                <w:sz w:val="20"/>
+              </w:rPr>
+              <w:t>) para apoiar a tomada de decisão do Projeto Integrador III que contemple:</w:t>
             </w:r>
             <w:r>
               <w:rPr>
@@ -9887,8 +10388,18 @@
                 <w:b/>
                 <w:sz w:val="20"/>
               </w:rPr>
-              <w:t>Uma avaliação crítica dos fatores macroambientais</w:t>
-            </w:r>
+              <w:t xml:space="preserve">Uma avaliação crítica dos fatores </w:t>
+            </w:r>
+            <w:proofErr w:type="spellStart"/>
+            <w:r>
+              <w:rPr>
+                <w:rFonts w:ascii="Arial" w:eastAsia="Arial" w:hAnsi="Arial" w:cs="Arial"/>
+                <w:b/>
+                <w:sz w:val="20"/>
+              </w:rPr>
+              <w:t>macroambientais</w:t>
+            </w:r>
+            <w:proofErr w:type="spellEnd"/>
             <w:r>
               <w:rPr>
                 <w:rFonts w:ascii="Arial" w:eastAsia="Arial" w:hAnsi="Arial" w:cs="Arial"/>
@@ -9920,7 +10431,71 @@
                 <w:rFonts w:ascii="Arial" w:eastAsia="Arial" w:hAnsi="Arial" w:cs="Arial"/>
                 <w:sz w:val="20"/>
               </w:rPr>
-              <w:t xml:space="preserve">, utilizando ferramentas como o modelo das Cinco Forças de Porter e a análise SWOT (Strengths, Weaknesses, Opportunities, Threats), </w:t>
+              <w:t>, utilizando ferramentas como o modelo das Cinco Forças de Porter e a análise SWOT (</w:t>
+            </w:r>
+            <w:proofErr w:type="spellStart"/>
+            <w:r>
+              <w:rPr>
+                <w:rFonts w:ascii="Arial" w:eastAsia="Arial" w:hAnsi="Arial" w:cs="Arial"/>
+                <w:sz w:val="20"/>
+              </w:rPr>
+              <w:t>Strengths</w:t>
+            </w:r>
+            <w:proofErr w:type="spellEnd"/>
+            <w:r>
+              <w:rPr>
+                <w:rFonts w:ascii="Arial" w:eastAsia="Arial" w:hAnsi="Arial" w:cs="Arial"/>
+                <w:sz w:val="20"/>
+              </w:rPr>
+              <w:t xml:space="preserve">, </w:t>
+            </w:r>
+            <w:proofErr w:type="spellStart"/>
+            <w:r>
+              <w:rPr>
+                <w:rFonts w:ascii="Arial" w:eastAsia="Arial" w:hAnsi="Arial" w:cs="Arial"/>
+                <w:sz w:val="20"/>
+              </w:rPr>
+              <w:t>Weaknesses</w:t>
+            </w:r>
+            <w:proofErr w:type="spellEnd"/>
+            <w:r>
+              <w:rPr>
+                <w:rFonts w:ascii="Arial" w:eastAsia="Arial" w:hAnsi="Arial" w:cs="Arial"/>
+                <w:sz w:val="20"/>
+              </w:rPr>
+              <w:t xml:space="preserve">, </w:t>
+            </w:r>
+            <w:proofErr w:type="spellStart"/>
+            <w:r>
+              <w:rPr>
+                <w:rFonts w:ascii="Arial" w:eastAsia="Arial" w:hAnsi="Arial" w:cs="Arial"/>
+                <w:sz w:val="20"/>
+              </w:rPr>
+              <w:t>Opportunities</w:t>
+            </w:r>
+            <w:proofErr w:type="spellEnd"/>
+            <w:r>
+              <w:rPr>
+                <w:rFonts w:ascii="Arial" w:eastAsia="Arial" w:hAnsi="Arial" w:cs="Arial"/>
+                <w:sz w:val="20"/>
+              </w:rPr>
+              <w:t xml:space="preserve">, </w:t>
+            </w:r>
+            <w:proofErr w:type="spellStart"/>
+            <w:r>
+              <w:rPr>
+                <w:rFonts w:ascii="Arial" w:eastAsia="Arial" w:hAnsi="Arial" w:cs="Arial"/>
+                <w:sz w:val="20"/>
+              </w:rPr>
+              <w:t>Threats</w:t>
+            </w:r>
+            <w:proofErr w:type="spellEnd"/>
+            <w:r>
+              <w:rPr>
+                <w:rFonts w:ascii="Arial" w:eastAsia="Arial" w:hAnsi="Arial" w:cs="Arial"/>
+                <w:sz w:val="20"/>
+              </w:rPr>
+              <w:t xml:space="preserve">), </w:t>
             </w:r>
             <w:r>
               <w:rPr>
@@ -10042,7 +10617,29 @@
                 <w:sz w:val="20"/>
                 <w:shd w:val="clear" w:color="auto" w:fill="FFFF00"/>
               </w:rPr>
-              <w:t>Pode se utilizar de insights por meio da Plataforma ChatGpt ou</w:t>
+              <w:t xml:space="preserve">Pode se utilizar de insights por meio da Plataforma </w:t>
+            </w:r>
+            <w:proofErr w:type="spellStart"/>
+            <w:r>
+              <w:rPr>
+                <w:rFonts w:ascii="Arial" w:eastAsia="Arial" w:hAnsi="Arial" w:cs="Arial"/>
+                <w:b/>
+                <w:color w:val="FF0000"/>
+                <w:sz w:val="20"/>
+                <w:shd w:val="clear" w:color="auto" w:fill="FFFF00"/>
+              </w:rPr>
+              <w:t>ChatGpt</w:t>
+            </w:r>
+            <w:proofErr w:type="spellEnd"/>
+            <w:r>
+              <w:rPr>
+                <w:rFonts w:ascii="Arial" w:eastAsia="Arial" w:hAnsi="Arial" w:cs="Arial"/>
+                <w:b/>
+                <w:color w:val="FF0000"/>
+                <w:sz w:val="20"/>
+                <w:shd w:val="clear" w:color="auto" w:fill="FFFF00"/>
+              </w:rPr>
+              <w:t xml:space="preserve"> ou</w:t>
             </w:r>
             <w:r>
               <w:rPr>
@@ -10457,7 +11054,6 @@
                 <w:b/>
                 <w:sz w:val="20"/>
               </w:rPr>
-              <w:lastRenderedPageBreak/>
               <w:t xml:space="preserve">Disciplina </w:t>
             </w:r>
           </w:p>
@@ -10479,7 +11075,25 @@
                 <w:i/>
                 <w:sz w:val="20"/>
               </w:rPr>
-              <w:t xml:space="preserve">Gestão de Projetos – Prof. Wagner Varalda </w:t>
+              <w:t xml:space="preserve">Gestão de Projetos – Prof. Wagner </w:t>
+            </w:r>
+            <w:proofErr w:type="spellStart"/>
+            <w:r>
+              <w:rPr>
+                <w:rFonts w:ascii="Arial" w:eastAsia="Arial" w:hAnsi="Arial" w:cs="Arial"/>
+                <w:i/>
+                <w:sz w:val="20"/>
+              </w:rPr>
+              <w:t>Varalda</w:t>
+            </w:r>
+            <w:proofErr w:type="spellEnd"/>
+            <w:r>
+              <w:rPr>
+                <w:rFonts w:ascii="Arial" w:eastAsia="Arial" w:hAnsi="Arial" w:cs="Arial"/>
+                <w:i/>
+                <w:sz w:val="20"/>
+              </w:rPr>
+              <w:t xml:space="preserve"> </w:t>
             </w:r>
           </w:p>
         </w:tc>
@@ -10509,6 +11123,7 @@
                 <w:b/>
                 <w:sz w:val="20"/>
               </w:rPr>
+              <w:lastRenderedPageBreak/>
               <w:t xml:space="preserve">Objetivos </w:t>
             </w:r>
           </w:p>
@@ -11028,7 +11643,23 @@
                 <w:rFonts w:ascii="Arial" w:eastAsia="Arial" w:hAnsi="Arial" w:cs="Arial"/>
                 <w:sz w:val="20"/>
               </w:rPr>
-              <w:t xml:space="preserve">Realizar a análise utilizando a linguagem Python com as bibliotecas Python necessárias (ex: Pandas). </w:t>
+              <w:t>Realizar a análise utilizando a linguagem Python com as bibliotecas Python necessárias (</w:t>
+            </w:r>
+            <w:proofErr w:type="spellStart"/>
+            <w:r>
+              <w:rPr>
+                <w:rFonts w:ascii="Arial" w:eastAsia="Arial" w:hAnsi="Arial" w:cs="Arial"/>
+                <w:sz w:val="20"/>
+              </w:rPr>
+              <w:t>ex</w:t>
+            </w:r>
+            <w:proofErr w:type="spellEnd"/>
+            <w:r>
+              <w:rPr>
+                <w:rFonts w:ascii="Arial" w:eastAsia="Arial" w:hAnsi="Arial" w:cs="Arial"/>
+                <w:sz w:val="20"/>
+              </w:rPr>
+              <w:t xml:space="preserve">: Pandas). </w:t>
             </w:r>
           </w:p>
         </w:tc>
@@ -11228,7 +11859,25 @@
                 <w:i/>
                 <w:sz w:val="20"/>
               </w:rPr>
-              <w:t xml:space="preserve">Estatística e Probabilidade II – Profa. Cláudia Courtouké </w:t>
+              <w:t xml:space="preserve">Estatística e Probabilidade II – Profa. Cláudia </w:t>
+            </w:r>
+            <w:proofErr w:type="spellStart"/>
+            <w:r>
+              <w:rPr>
+                <w:rFonts w:ascii="Arial" w:eastAsia="Arial" w:hAnsi="Arial" w:cs="Arial"/>
+                <w:i/>
+                <w:sz w:val="20"/>
+              </w:rPr>
+              <w:t>Courtouké</w:t>
+            </w:r>
+            <w:proofErr w:type="spellEnd"/>
+            <w:r>
+              <w:rPr>
+                <w:rFonts w:ascii="Arial" w:eastAsia="Arial" w:hAnsi="Arial" w:cs="Arial"/>
+                <w:i/>
+                <w:sz w:val="20"/>
+              </w:rPr>
+              <w:t xml:space="preserve"> </w:t>
             </w:r>
           </w:p>
         </w:tc>
@@ -11282,7 +11931,23 @@
                 <w:rFonts w:ascii="Arial" w:eastAsia="Arial" w:hAnsi="Arial" w:cs="Arial"/>
                 <w:sz w:val="20"/>
               </w:rPr>
-              <w:t>Definir o escopo do estudo estatístico e estabelecer o que será analisado. Garantir a representatividade da amostra e a confiabilidade das inferências. Fornecer uma estimativa da média (estimador) com uma margem de erro, considerando a variabilidade amostral. Testar uma hipótese sobre o valor da média populacional (parâmetro) e verificar, com base nos dados da amostra, se há evidências estatísticas para aceitar ou rejeitar essa hipótese. Entender como as variáveis estão relacionadas e prever valores futuros para a variável resposta. Estruturar corretamente o modelo de regressão. Assegurar que o modelo faz boas estimativas dos efeitos das variáveis preditoras. Validar a utilidade do modelo para previsões e análises.</w:t>
+              <w:t xml:space="preserve">Definir o escopo do estudo estatístico e estabelecer o que será analisado. Garantir a representatividade da amostra e a confiabilidade das inferências. </w:t>
+            </w:r>
+            <w:proofErr w:type="spellStart"/>
+            <w:r>
+              <w:rPr>
+                <w:rFonts w:ascii="Arial" w:eastAsia="Arial" w:hAnsi="Arial" w:cs="Arial"/>
+                <w:sz w:val="20"/>
+              </w:rPr>
+              <w:t>Fornecer</w:t>
+            </w:r>
+            <w:proofErr w:type="spellEnd"/>
+            <w:r>
+              <w:rPr>
+                <w:rFonts w:ascii="Arial" w:eastAsia="Arial" w:hAnsi="Arial" w:cs="Arial"/>
+                <w:sz w:val="20"/>
+              </w:rPr>
+              <w:t xml:space="preserve"> uma estimativa da média (estimador) com uma margem de erro, considerando a variabilidade amostral. Testar uma hipótese sobre o valor da média populacional (parâmetro) e verificar, com base nos dados da amostra, se há evidências estatísticas para aceitar ou rejeitar essa hipótese. Entender como as variáveis estão relacionadas e prever valores futuros para a variável resposta. Estruturar corretamente o modelo de regressão. Assegurar que o modelo faz boas estimativas dos efeitos das variáveis preditoras. Validar a utilidade do modelo para previsões e análises.</w:t>
             </w:r>
             <w:r>
               <w:rPr>
@@ -12200,7 +12865,25 @@
                 <w:i/>
                 <w:sz w:val="20"/>
               </w:rPr>
-              <w:t xml:space="preserve">Programação em Banco de Dados I – Prof. Rodrigo Bossini </w:t>
+              <w:t xml:space="preserve">Programação em Banco de Dados I – Prof. Rodrigo </w:t>
+            </w:r>
+            <w:proofErr w:type="spellStart"/>
+            <w:r>
+              <w:rPr>
+                <w:rFonts w:ascii="Arial" w:eastAsia="Arial" w:hAnsi="Arial" w:cs="Arial"/>
+                <w:i/>
+                <w:sz w:val="20"/>
+              </w:rPr>
+              <w:t>Bossini</w:t>
+            </w:r>
+            <w:proofErr w:type="spellEnd"/>
+            <w:r>
+              <w:rPr>
+                <w:rFonts w:ascii="Arial" w:eastAsia="Arial" w:hAnsi="Arial" w:cs="Arial"/>
+                <w:i/>
+                <w:sz w:val="20"/>
+              </w:rPr>
+              <w:t xml:space="preserve"> </w:t>
             </w:r>
           </w:p>
         </w:tc>
@@ -12353,7 +13036,23 @@
                 <w:rFonts w:ascii="Arial" w:eastAsia="Arial" w:hAnsi="Arial" w:cs="Arial"/>
                 <w:sz w:val="20"/>
               </w:rPr>
-              <w:t>Repositório no Github público contendo um arquivo chamado README.md. O arquivo deve conter os nomes e RAs dos integrantes, nome do projeto e descrição sobre o seu propósito.</w:t>
+              <w:t xml:space="preserve">Repositório no Github público contendo um arquivo chamado README.md. O arquivo deve conter os nomes e </w:t>
+            </w:r>
+            <w:proofErr w:type="spellStart"/>
+            <w:r>
+              <w:rPr>
+                <w:rFonts w:ascii="Arial" w:eastAsia="Arial" w:hAnsi="Arial" w:cs="Arial"/>
+                <w:sz w:val="20"/>
+              </w:rPr>
+              <w:t>RAs</w:t>
+            </w:r>
+            <w:proofErr w:type="spellEnd"/>
+            <w:r>
+              <w:rPr>
+                <w:rFonts w:ascii="Arial" w:eastAsia="Arial" w:hAnsi="Arial" w:cs="Arial"/>
+                <w:sz w:val="20"/>
+              </w:rPr>
+              <w:t xml:space="preserve"> dos integrantes, nome do projeto e descrição sobre o seu propósito.</w:t>
             </w:r>
             <w:r>
               <w:rPr>
@@ -12465,6 +13164,7 @@
               </w:rPr>
               <w:t xml:space="preserve"> </w:t>
             </w:r>
+            <w:proofErr w:type="spellStart"/>
             <w:r>
               <w:rPr>
                 <w:rFonts w:ascii="Arial" w:eastAsia="Arial" w:hAnsi="Arial" w:cs="Arial"/>
@@ -12474,6 +13174,7 @@
               </w:rPr>
               <w:t>Stored</w:t>
             </w:r>
+            <w:proofErr w:type="spellEnd"/>
             <w:r>
               <w:rPr>
                 <w:rFonts w:ascii="Arial" w:eastAsia="Arial" w:hAnsi="Arial" w:cs="Arial"/>
@@ -13406,7 +14107,25 @@
                 <w:sz w:val="20"/>
                 <w:szCs w:val="20"/>
               </w:rPr>
-              <w:t>Alta inflação, aumento do preço do aço e juros elevados podem aumentar os custos operacionais da MFix, reduzir margens de   lucro e dificultar investimentos em expansão e estoque.</w:t>
+              <w:t xml:space="preserve">Alta inflação, aumento do preço do aço e juros elevados podem aumentar os custos operacionais da </w:t>
+            </w:r>
+            <w:proofErr w:type="spellStart"/>
+            <w:r>
+              <w:rPr>
+                <w:rFonts w:ascii="Arial" w:hAnsi="Arial" w:cs="Arial"/>
+                <w:sz w:val="20"/>
+                <w:szCs w:val="20"/>
+              </w:rPr>
+              <w:t>MFix</w:t>
+            </w:r>
+            <w:proofErr w:type="spellEnd"/>
+            <w:r>
+              <w:rPr>
+                <w:rFonts w:ascii="Arial" w:hAnsi="Arial" w:cs="Arial"/>
+                <w:sz w:val="20"/>
+                <w:szCs w:val="20"/>
+              </w:rPr>
+              <w:t>, reduzir margens de   lucro e dificultar investimentos em expansão e estoque.</w:t>
             </w:r>
           </w:p>
         </w:tc>
@@ -13713,7 +14432,25 @@
                 <w:sz w:val="20"/>
                 <w:szCs w:val="20"/>
               </w:rPr>
-              <w:t>O crescimento da construção civil e da indústria aumenta a procura por fixadores, ferragens e soluções industriais, ampliando o mercado consumidor da MFix.</w:t>
+              <w:t xml:space="preserve">O crescimento da construção civil e da indústria aumenta a procura por fixadores, ferragens e soluções industriais, ampliando o mercado consumidor da </w:t>
+            </w:r>
+            <w:proofErr w:type="spellStart"/>
+            <w:r>
+              <w:rPr>
+                <w:rFonts w:ascii="Arial" w:hAnsi="Arial" w:cs="Arial"/>
+                <w:sz w:val="20"/>
+                <w:szCs w:val="20"/>
+              </w:rPr>
+              <w:t>MFix</w:t>
+            </w:r>
+            <w:proofErr w:type="spellEnd"/>
+            <w:r>
+              <w:rPr>
+                <w:rFonts w:ascii="Arial" w:hAnsi="Arial" w:cs="Arial"/>
+                <w:sz w:val="20"/>
+                <w:szCs w:val="20"/>
+              </w:rPr>
+              <w:t>.</w:t>
             </w:r>
           </w:p>
         </w:tc>
@@ -14138,7 +14875,25 @@
                 <w:sz w:val="20"/>
                 <w:szCs w:val="20"/>
               </w:rPr>
-              <w:t>Empresas concorrentes podem oferecer preços menores, maior variedade de produtos e marcas consolidadas, reduzindo a participação da MFix no mercado.</w:t>
+              <w:t xml:space="preserve">Empresas concorrentes podem oferecer preços menores, maior variedade de produtos e marcas consolidadas, reduzindo a participação da </w:t>
+            </w:r>
+            <w:proofErr w:type="spellStart"/>
+            <w:r>
+              <w:rPr>
+                <w:rFonts w:ascii="Arial" w:hAnsi="Arial" w:cs="Arial"/>
+                <w:sz w:val="20"/>
+                <w:szCs w:val="20"/>
+              </w:rPr>
+              <w:t>MFix</w:t>
+            </w:r>
+            <w:proofErr w:type="spellEnd"/>
+            <w:r>
+              <w:rPr>
+                <w:rFonts w:ascii="Arial" w:hAnsi="Arial" w:cs="Arial"/>
+                <w:sz w:val="20"/>
+                <w:szCs w:val="20"/>
+              </w:rPr>
+              <w:t xml:space="preserve"> no mercado.</w:t>
             </w:r>
           </w:p>
         </w:tc>
@@ -14176,7 +14931,25 @@
                 <w:sz w:val="20"/>
                 <w:szCs w:val="20"/>
               </w:rPr>
-              <w:t>A MFix pode destacar-se por meio do atendimento personalizado, rapidez nas entregas, qualidade dos produtos e relacionamento próximo com clientes.</w:t>
+              <w:t xml:space="preserve">A </w:t>
+            </w:r>
+            <w:proofErr w:type="spellStart"/>
+            <w:r>
+              <w:rPr>
+                <w:rFonts w:ascii="Arial" w:hAnsi="Arial" w:cs="Arial"/>
+                <w:sz w:val="20"/>
+                <w:szCs w:val="20"/>
+              </w:rPr>
+              <w:t>MFix</w:t>
+            </w:r>
+            <w:proofErr w:type="spellEnd"/>
+            <w:r>
+              <w:rPr>
+                <w:rFonts w:ascii="Arial" w:hAnsi="Arial" w:cs="Arial"/>
+                <w:sz w:val="20"/>
+                <w:szCs w:val="20"/>
+              </w:rPr>
+              <w:t xml:space="preserve"> pode destacar-se por meio do atendimento personalizado, rapidez nas entregas, qualidade dos produtos e relacionamento próximo com clientes.</w:t>
             </w:r>
           </w:p>
         </w:tc>
@@ -14682,7 +15455,25 @@
                 <w:sz w:val="20"/>
                 <w:szCs w:val="20"/>
               </w:rPr>
-              <w:t>A experiência da MFix, seu conhecimento técnico e sua carteira de clientes fortalecem sua posição competitiva.</w:t>
+              <w:t xml:space="preserve">A experiência da </w:t>
+            </w:r>
+            <w:proofErr w:type="spellStart"/>
+            <w:r>
+              <w:rPr>
+                <w:rFonts w:ascii="Arial" w:hAnsi="Arial" w:cs="Arial"/>
+                <w:sz w:val="20"/>
+                <w:szCs w:val="20"/>
+              </w:rPr>
+              <w:t>MFix</w:t>
+            </w:r>
+            <w:proofErr w:type="spellEnd"/>
+            <w:r>
+              <w:rPr>
+                <w:rFonts w:ascii="Arial" w:hAnsi="Arial" w:cs="Arial"/>
+                <w:sz w:val="20"/>
+                <w:szCs w:val="20"/>
+              </w:rPr>
+              <w:t>, seu conhecimento técnico e sua carteira de clientes fortalecem sua posição competitiva.</w:t>
             </w:r>
           </w:p>
         </w:tc>
@@ -15685,7 +16476,23 @@
           <w:rFonts w:ascii="Arial" w:hAnsi="Arial" w:cs="Arial"/>
           <w:szCs w:val="22"/>
         </w:rPr>
-        <w:t xml:space="preserve">A MFix busca consolidar-se como referência no setor de fixadores e ferragens industriais, </w:t>
+        <w:t xml:space="preserve">A </w:t>
+      </w:r>
+      <w:proofErr w:type="spellStart"/>
+      <w:r>
+        <w:rPr>
+          <w:rFonts w:ascii="Arial" w:hAnsi="Arial" w:cs="Arial"/>
+          <w:szCs w:val="22"/>
+        </w:rPr>
+        <w:t>MFix</w:t>
+      </w:r>
+      <w:proofErr w:type="spellEnd"/>
+      <w:r>
+        <w:rPr>
+          <w:rFonts w:ascii="Arial" w:hAnsi="Arial" w:cs="Arial"/>
+          <w:szCs w:val="22"/>
+        </w:rPr>
+        <w:t xml:space="preserve"> busca consolidar-se como referência no setor de fixadores e ferragens industriais, </w:t>
       </w:r>
       <w:r>
         <w:rPr>
@@ -16227,7 +17034,7 @@
           <w:rFonts w:ascii="Arial" w:hAnsi="Arial" w:cs="Arial"/>
           <w:szCs w:val="22"/>
         </w:rPr>
-        <w:t xml:space="preserve">Nesta segunda entrega da disciplina de Gestão de Projetos, foram desenvolvidos os artefatos relacionados ao gerenciamento de custos e riscos do Projeto Integrador III da MFIX Fixadores. O objetivo desta etapa é apresentar mecanismos de planejamento, controle e </w:t>
+        <w:t xml:space="preserve">Nesta segunda entrega da disciplina de Gestão de Projetos, foram desenvolvidos os artefatos relacionados ao gerenciamento de custos e riscos do Projeto Integrador III da MFIX </w:t>
       </w:r>
       <w:r>
         <w:rPr>
@@ -16235,7 +17042,7 @@
           <w:szCs w:val="22"/>
         </w:rPr>
         <w:lastRenderedPageBreak/>
-        <w:t>monitoramento capazes de auxiliar na organização do projeto e no acompanhamento das atividades desenvolvidas durante a construção da solução informatizada.</w:t>
+        <w:t>Fixadores. O objetivo desta etapa é apresentar mecanismos de planejamento, controle e monitoramento capazes de auxiliar na organização do projeto e no acompanhamento das atividades desenvolvidas durante a construção da solução informatizada.</w:t>
       </w:r>
     </w:p>
     <w:p>
@@ -17850,7 +18657,23 @@
           <w:rFonts w:ascii="Arial" w:hAnsi="Arial" w:cs="Arial"/>
           <w:szCs w:val="22"/>
         </w:rPr>
-        <w:t xml:space="preserve">Valor total estimado do projeto MFix  </w:t>
+        <w:t xml:space="preserve">Valor total estimado do projeto </w:t>
+      </w:r>
+      <w:proofErr w:type="spellStart"/>
+      <w:r>
+        <w:rPr>
+          <w:rFonts w:ascii="Arial" w:hAnsi="Arial" w:cs="Arial"/>
+          <w:szCs w:val="22"/>
+        </w:rPr>
+        <w:t>MFix</w:t>
+      </w:r>
+      <w:proofErr w:type="spellEnd"/>
+      <w:r>
+        <w:rPr>
+          <w:rFonts w:ascii="Arial" w:hAnsi="Arial" w:cs="Arial"/>
+          <w:szCs w:val="22"/>
+        </w:rPr>
+        <w:t xml:space="preserve">  </w:t>
       </w:r>
       <w:r>
         <w:rPr>
@@ -18253,8 +19076,18 @@
                 <w:sz w:val="20"/>
                 <w:szCs w:val="20"/>
               </w:rPr>
-              <w:t>Falhas na integração entre banco de dados e dw</w:t>
-            </w:r>
+              <w:t xml:space="preserve">Falhas na integração entre banco de dados e </w:t>
+            </w:r>
+            <w:proofErr w:type="spellStart"/>
+            <w:r>
+              <w:rPr>
+                <w:rFonts w:ascii="Arial" w:hAnsi="Arial" w:cs="Arial"/>
+                <w:sz w:val="20"/>
+                <w:szCs w:val="20"/>
+              </w:rPr>
+              <w:t>dw</w:t>
+            </w:r>
+            <w:proofErr w:type="spellEnd"/>
           </w:p>
         </w:tc>
         <w:tc>
@@ -18379,8 +19212,18 @@
                 <w:sz w:val="20"/>
                 <w:szCs w:val="20"/>
               </w:rPr>
-              <w:t>Inconsistência nos dados utilizados no etl</w:t>
-            </w:r>
+              <w:t xml:space="preserve">Inconsistência nos dados utilizados no </w:t>
+            </w:r>
+            <w:proofErr w:type="spellStart"/>
+            <w:r>
+              <w:rPr>
+                <w:rFonts w:ascii="Arial" w:hAnsi="Arial" w:cs="Arial"/>
+                <w:sz w:val="20"/>
+                <w:szCs w:val="20"/>
+              </w:rPr>
+              <w:t>etl</w:t>
+            </w:r>
+            <w:proofErr w:type="spellEnd"/>
           </w:p>
         </w:tc>
         <w:tc>
@@ -18632,8 +19475,18 @@
                 <w:sz w:val="20"/>
                 <w:szCs w:val="20"/>
               </w:rPr>
-              <w:t>Problemas de compatibilidade entre bibliotecas python</w:t>
-            </w:r>
+              <w:t xml:space="preserve">Problemas de compatibilidade entre bibliotecas </w:t>
+            </w:r>
+            <w:proofErr w:type="spellStart"/>
+            <w:r>
+              <w:rPr>
+                <w:rFonts w:ascii="Arial" w:hAnsi="Arial" w:cs="Arial"/>
+                <w:sz w:val="20"/>
+                <w:szCs w:val="20"/>
+              </w:rPr>
+              <w:t>python</w:t>
+            </w:r>
+            <w:proofErr w:type="spellEnd"/>
           </w:p>
         </w:tc>
         <w:tc>
@@ -19409,7 +20262,25 @@
                 <w:sz w:val="20"/>
                 <w:szCs w:val="20"/>
               </w:rPr>
-              <w:t>Problemas em consultas sql e integrações</w:t>
+              <w:t xml:space="preserve">Problemas em consultas </w:t>
+            </w:r>
+            <w:proofErr w:type="spellStart"/>
+            <w:r>
+              <w:rPr>
+                <w:rFonts w:ascii="Arial" w:hAnsi="Arial" w:cs="Arial"/>
+                <w:sz w:val="20"/>
+                <w:szCs w:val="20"/>
+              </w:rPr>
+              <w:t>sql</w:t>
+            </w:r>
+            <w:proofErr w:type="spellEnd"/>
+            <w:r>
+              <w:rPr>
+                <w:rFonts w:ascii="Arial" w:hAnsi="Arial" w:cs="Arial"/>
+                <w:sz w:val="20"/>
+                <w:szCs w:val="20"/>
+              </w:rPr>
+              <w:t xml:space="preserve"> e integrações</w:t>
             </w:r>
           </w:p>
         </w:tc>
@@ -19897,6 +20768,7 @@
         </w:rPr>
         <w:t xml:space="preserve"> </w:t>
       </w:r>
+      <w:proofErr w:type="spellStart"/>
       <w:r>
         <w:rPr>
           <w:rFonts w:ascii="Arial" w:hAnsi="Arial" w:cs="Arial"/>
@@ -19904,6 +20776,7 @@
         </w:rPr>
         <w:t>qtde_prod</w:t>
       </w:r>
+      <w:proofErr w:type="spellEnd"/>
     </w:p>
     <w:p>
       <w:pPr>
@@ -19965,6 +20838,7 @@
         </w:rPr>
         <w:t xml:space="preserve"> </w:t>
       </w:r>
+      <w:proofErr w:type="spellStart"/>
       <w:r>
         <w:rPr>
           <w:rFonts w:ascii="Arial" w:hAnsi="Arial" w:cs="Arial"/>
@@ -19972,6 +20846,7 @@
         </w:rPr>
         <w:t>preco_venda</w:t>
       </w:r>
+      <w:proofErr w:type="spellEnd"/>
     </w:p>
     <w:p>
       <w:pPr>
@@ -20037,7 +20912,23 @@
           <w:rFonts w:ascii="Arial" w:hAnsi="Arial" w:cs="Arial"/>
           <w:szCs w:val="22"/>
         </w:rPr>
-        <w:t>O modelo foi desenvolvido utilizando a biblioteca Scikit-Learn da linguagem Python.</w:t>
+        <w:t xml:space="preserve">O modelo foi desenvolvido utilizando a biblioteca </w:t>
+      </w:r>
+      <w:proofErr w:type="spellStart"/>
+      <w:r>
+        <w:rPr>
+          <w:rFonts w:ascii="Arial" w:hAnsi="Arial" w:cs="Arial"/>
+          <w:szCs w:val="22"/>
+        </w:rPr>
+        <w:t>Scikit-Learn</w:t>
+      </w:r>
+      <w:proofErr w:type="spellEnd"/>
+      <w:r>
+        <w:rPr>
+          <w:rFonts w:ascii="Arial" w:hAnsi="Arial" w:cs="Arial"/>
+          <w:szCs w:val="22"/>
+        </w:rPr>
+        <w:t xml:space="preserve"> da linguagem Python.</w:t>
       </w:r>
     </w:p>
     <w:p>
@@ -22915,7 +23806,15 @@
           <w:rFonts w:ascii="Arial" w:hAnsi="Arial" w:cs="Arial"/>
           <w:szCs w:val="22"/>
         </w:rPr>
-        <w:t>Com o objetivo de reduzir distorções estatísticas provocadas por movimentações atípicas, foi realizado um tratamento para remoção de outliers. Essa etapa mostrou-se necessária devido à grande variação de preços existente entre os produtos da base, uma vez que determinados itens possuem valores inferiores a um real, enquanto outros alcançam valores de milhares de reais.</w:t>
+        <w:t xml:space="preserve">Com o objetivo de reduzir distorções estatísticas provocadas por movimentações atípicas, foi realizado um tratamento para remoção de outliers. Essa etapa mostrou-se necessária devido à grande variação de preços existente entre os produtos da base, uma vez que determinados </w:t>
+      </w:r>
+      <w:r>
+        <w:rPr>
+          <w:rFonts w:ascii="Arial" w:hAnsi="Arial" w:cs="Arial"/>
+          <w:szCs w:val="22"/>
+        </w:rPr>
+        <w:lastRenderedPageBreak/>
+        <w:t>itens possuem valores inferiores a um real, enquanto outros alcançam valores de milhares de reais.</w:t>
       </w:r>
     </w:p>
     <w:p>
@@ -22933,7 +23832,6 @@
           <w:rFonts w:ascii="Arial" w:hAnsi="Arial" w:cs="Arial"/>
           <w:szCs w:val="22"/>
         </w:rPr>
-        <w:lastRenderedPageBreak/>
         <w:t>Após o tratamento dos dados, as informações foram consolidadas em uma série temporal semanal, permitindo observar a evolução histórica do faturamento médio ao longo do período estudado.</w:t>
       </w:r>
     </w:p>
@@ -23080,7 +23978,7 @@
           <w:rFonts w:ascii="Arial" w:hAnsi="Arial" w:cs="Arial"/>
           <w:szCs w:val="22"/>
         </w:rPr>
-        <w:t xml:space="preserve">O primeiro conceito empregado foi o aprendizado supervisionado, no qual o algoritmo recebe exemplos históricos contendo entradas e saídas conhecidas, utilizando essas informações para identificar padrões e realizar previsões futuras. Outro conceito relevante é o ajuste de parâmetros. Durante o treinamento, o modelo determina automaticamente os coeficientes que melhor representam o comportamento dos dados observados. Esse processo é semelhante ao mecanismo utilizado por redes neurais artificiais para ajuste de pesos sinápticos. Também foi aplicado o princípio da minimização do erro, no qual o algoritmo procura reduzir a diferença entre os valores reais e os valores estimados. Esse conceito constitui um dos </w:t>
+        <w:t xml:space="preserve">O primeiro conceito empregado foi o aprendizado supervisionado, no qual o algoritmo recebe exemplos históricos contendo entradas e saídas conhecidas, utilizando essas informações para identificar padrões e realizar previsões futuras. Outro conceito relevante é o ajuste de parâmetros. Durante o treinamento, o modelo determina automaticamente os coeficientes que melhor representam o comportamento dos dados observados. Esse processo é semelhante ao mecanismo utilizado por redes neurais artificiais para ajuste de pesos sinápticos. </w:t>
       </w:r>
       <w:r>
         <w:rPr>
@@ -23088,7 +23986,7 @@
           <w:szCs w:val="22"/>
         </w:rPr>
         <w:lastRenderedPageBreak/>
-        <w:t>fundamentos dos modelos conexionistas modernos. Por fim, destaca-se a capacidade de generalização do modelo. Em vez de simplesmente reproduzir os dados históricos, o algoritmo utiliza os padrões aprendidos para estimar valores em períodos ainda não observados, produzindo informações úteis para o planejamento organizacional.</w:t>
+        <w:t>Também foi aplicado o princípio da minimização do erro, no qual o algoritmo procura reduzir a diferença entre os valores reais e os valores estimados. Esse conceito constitui um dos fundamentos dos modelos conexionistas modernos. Por fim, destaca-se a capacidade de generalização do modelo. Em vez de simplesmente reproduzir os dados históricos, o algoritmo utiliza os padrões aprendidos para estimar valores em períodos ainda não observados, produzindo informações úteis para o planejamento organizacional.</w:t>
       </w:r>
     </w:p>
     <w:p>
@@ -23169,6 +24067,7 @@
       </w:pPr>
       <w:bookmarkStart w:id="40" w:name="_Toc231652381"/>
       <w:r>
+        <w:lastRenderedPageBreak/>
         <w:t>9</w:t>
       </w:r>
       <w:r>
@@ -23218,7 +24117,6 @@
           <w:rFonts w:ascii="Arial" w:hAnsi="Arial" w:cs="Arial"/>
           <w:szCs w:val="22"/>
         </w:rPr>
-        <w:lastRenderedPageBreak/>
         <w:t>Os resultados demonstraram que, após o tratamento dos dados e a remoção de valores atípicos, o comportamento da série apresentou relativa estabilidade, fato que foi refletido nas previsões produzidas pelo modelo. Embora oscilações estejam presentes ao longo do histórico, não foram identificadas tendências expressivas de crescimento ou retração no curto prazo.</w:t>
       </w:r>
     </w:p>
@@ -23282,7 +24180,23 @@
           <w:rFonts w:ascii="Arial" w:hAnsi="Arial" w:cs="Arial"/>
           <w:szCs w:val="22"/>
         </w:rPr>
-        <w:t>O sistema foi construído utilizando PostgreSQL como Sistema Gerenciador de Banco de Dados e Flask como camada de aplicação, permitindo a consulta e análise de informações relacionadas a produtos, fornecedores, transportadoras, lotes e movimentações de entrada e saída de estoque.</w:t>
+        <w:t xml:space="preserve">O sistema foi construído utilizando PostgreSQL como Sistema Gerenciador de Banco de Dados e </w:t>
+      </w:r>
+      <w:proofErr w:type="spellStart"/>
+      <w:r>
+        <w:rPr>
+          <w:rFonts w:ascii="Arial" w:hAnsi="Arial" w:cs="Arial"/>
+          <w:szCs w:val="22"/>
+        </w:rPr>
+        <w:t>Flask</w:t>
+      </w:r>
+      <w:proofErr w:type="spellEnd"/>
+      <w:r>
+        <w:rPr>
+          <w:rFonts w:ascii="Arial" w:hAnsi="Arial" w:cs="Arial"/>
+          <w:szCs w:val="22"/>
+        </w:rPr>
+        <w:t xml:space="preserve"> como camada de aplicação, permitindo a consulta e análise de informações relacionadas a produtos, fornecedores, transportadoras, lotes e movimentações de entrada e saída de estoque.</w:t>
       </w:r>
     </w:p>
     <w:p>
@@ -23322,7 +24236,23 @@
           <w:rFonts w:ascii="Arial" w:hAnsi="Arial" w:cs="Arial"/>
           <w:szCs w:val="22"/>
         </w:rPr>
-        <w:t>Uma Stored Procedure utilizando cursor e SQL dinâmica para recuperação de informações;</w:t>
+        <w:t xml:space="preserve">Uma </w:t>
+      </w:r>
+      <w:proofErr w:type="spellStart"/>
+      <w:r>
+        <w:rPr>
+          <w:rFonts w:ascii="Arial" w:hAnsi="Arial" w:cs="Arial"/>
+          <w:szCs w:val="22"/>
+        </w:rPr>
+        <w:t>Stored</w:t>
+      </w:r>
+      <w:proofErr w:type="spellEnd"/>
+      <w:r>
+        <w:rPr>
+          <w:rFonts w:ascii="Arial" w:hAnsi="Arial" w:cs="Arial"/>
+          <w:szCs w:val="22"/>
+        </w:rPr>
+        <w:t xml:space="preserve"> Procedure utilizando cursor e SQL dinâmica para recuperação de informações;</w:t>
       </w:r>
     </w:p>
     <w:p>
@@ -23362,7 +24292,23 @@
           <w:rFonts w:ascii="Arial" w:hAnsi="Arial" w:cs="Arial"/>
           <w:szCs w:val="22"/>
         </w:rPr>
-        <w:t>Além disso, foi desenvolvida uma Stored Procedure específica para geração de estatísticas relacionadas ao desempenho dos produtos comercializados.</w:t>
+        <w:t xml:space="preserve">Além disso, foi desenvolvida uma </w:t>
+      </w:r>
+      <w:proofErr w:type="spellStart"/>
+      <w:r>
+        <w:rPr>
+          <w:rFonts w:ascii="Arial" w:hAnsi="Arial" w:cs="Arial"/>
+          <w:szCs w:val="22"/>
+        </w:rPr>
+        <w:t>Stored</w:t>
+      </w:r>
+      <w:proofErr w:type="spellEnd"/>
+      <w:r>
+        <w:rPr>
+          <w:rFonts w:ascii="Arial" w:hAnsi="Arial" w:cs="Arial"/>
+          <w:szCs w:val="22"/>
+        </w:rPr>
+        <w:t xml:space="preserve"> Procedure específica para geração de estatísticas relacionadas ao desempenho dos produtos comercializados.</w:t>
       </w:r>
     </w:p>
     <w:p>
@@ -23371,6 +24317,7 @@
       </w:pPr>
       <w:bookmarkStart w:id="42" w:name="_Toc231652383"/>
       <w:r>
+        <w:lastRenderedPageBreak/>
         <w:t>10</w:t>
       </w:r>
       <w:r>
@@ -23417,8 +24364,23 @@
           <w:rFonts w:ascii="Arial" w:hAnsi="Arial" w:cs="Arial"/>
           <w:szCs w:val="22"/>
         </w:rPr>
-        <w:lastRenderedPageBreak/>
-        <w:t>A estrutura principal é composta pela tabela fato_movimentacao, responsável pelo armazenamento dos eventos de negócio, e por diversas tabelas dimensionais que descrevem os elementos envolvidos em cada movimentação.</w:t>
+        <w:t xml:space="preserve">A estrutura principal é composta pela tabela </w:t>
+      </w:r>
+      <w:proofErr w:type="spellStart"/>
+      <w:r>
+        <w:rPr>
+          <w:rFonts w:ascii="Arial" w:hAnsi="Arial" w:cs="Arial"/>
+          <w:szCs w:val="22"/>
+        </w:rPr>
+        <w:t>fato_movimentacao</w:t>
+      </w:r>
+      <w:proofErr w:type="spellEnd"/>
+      <w:r>
+        <w:rPr>
+          <w:rFonts w:ascii="Arial" w:hAnsi="Arial" w:cs="Arial"/>
+          <w:szCs w:val="22"/>
+        </w:rPr>
+        <w:t>, responsável pelo armazenamento dos eventos de negócio, e por diversas tabelas dimensionais que descrevem os elementos envolvidos em cada movimentação.</w:t>
       </w:r>
     </w:p>
     <w:p>
@@ -23453,6 +24415,7 @@
           <w:szCs w:val="22"/>
         </w:rPr>
       </w:pPr>
+      <w:proofErr w:type="spellStart"/>
       <w:r>
         <w:rPr>
           <w:rFonts w:ascii="Arial" w:hAnsi="Arial" w:cs="Arial"/>
@@ -23460,6 +24423,7 @@
         </w:rPr>
         <w:t>dim_produto</w:t>
       </w:r>
+      <w:proofErr w:type="spellEnd"/>
     </w:p>
     <w:p>
       <w:pPr>
@@ -23475,6 +24439,7 @@
           <w:szCs w:val="22"/>
         </w:rPr>
       </w:pPr>
+      <w:proofErr w:type="spellStart"/>
       <w:r>
         <w:rPr>
           <w:rFonts w:ascii="Arial" w:hAnsi="Arial" w:cs="Arial"/>
@@ -23482,6 +24447,7 @@
         </w:rPr>
         <w:t>dim_fornecedor</w:t>
       </w:r>
+      <w:proofErr w:type="spellEnd"/>
     </w:p>
     <w:p>
       <w:pPr>
@@ -23497,6 +24463,7 @@
           <w:szCs w:val="22"/>
         </w:rPr>
       </w:pPr>
+      <w:proofErr w:type="spellStart"/>
       <w:r>
         <w:rPr>
           <w:rFonts w:ascii="Arial" w:hAnsi="Arial" w:cs="Arial"/>
@@ -23504,6 +24471,7 @@
         </w:rPr>
         <w:t>dim_transportadora</w:t>
       </w:r>
+      <w:proofErr w:type="spellEnd"/>
     </w:p>
     <w:p>
       <w:pPr>
@@ -23519,6 +24487,7 @@
           <w:szCs w:val="22"/>
         </w:rPr>
       </w:pPr>
+      <w:proofErr w:type="spellStart"/>
       <w:r>
         <w:rPr>
           <w:rFonts w:ascii="Arial" w:hAnsi="Arial" w:cs="Arial"/>
@@ -23526,6 +24495,7 @@
         </w:rPr>
         <w:t>dim_lote</w:t>
       </w:r>
+      <w:proofErr w:type="spellEnd"/>
     </w:p>
     <w:p>
       <w:pPr>
@@ -23541,6 +24511,7 @@
           <w:szCs w:val="22"/>
         </w:rPr>
       </w:pPr>
+      <w:proofErr w:type="spellStart"/>
       <w:r>
         <w:rPr>
           <w:rFonts w:ascii="Arial" w:hAnsi="Arial" w:cs="Arial"/>
@@ -23548,6 +24519,7 @@
         </w:rPr>
         <w:t>dim_tipo_mov</w:t>
       </w:r>
+      <w:proofErr w:type="spellEnd"/>
     </w:p>
     <w:p>
       <w:pPr>
@@ -23582,7 +24554,15 @@
         <w:t>2</w:t>
       </w:r>
       <w:r>
-        <w:t xml:space="preserve"> Implementação da Stored Procedure com Cursor Dinâmico</w:t>
+        <w:t xml:space="preserve"> Implementação da </w:t>
+      </w:r>
+      <w:proofErr w:type="spellStart"/>
+      <w:r>
+        <w:t>Stored</w:t>
+      </w:r>
+      <w:proofErr w:type="spellEnd"/>
+      <w:r>
+        <w:t xml:space="preserve"> Procedure com Cursor Dinâmico</w:t>
       </w:r>
       <w:bookmarkEnd w:id="43"/>
     </w:p>
@@ -23601,7 +24581,23 @@
           <w:rFonts w:ascii="Arial" w:hAnsi="Arial" w:cs="Arial"/>
           <w:szCs w:val="22"/>
         </w:rPr>
-        <w:t>Foi desenvolvida a procedure denominada sp_movimentacao_filtro com o objetivo de permitir consultas flexíveis sobre os registros de movimentação armazenados no Data Warehouse.</w:t>
+        <w:t xml:space="preserve">Foi desenvolvida a procedure denominada </w:t>
+      </w:r>
+      <w:proofErr w:type="spellStart"/>
+      <w:r>
+        <w:rPr>
+          <w:rFonts w:ascii="Arial" w:hAnsi="Arial" w:cs="Arial"/>
+          <w:szCs w:val="22"/>
+        </w:rPr>
+        <w:t>sp_movimentacao_filtro</w:t>
+      </w:r>
+      <w:proofErr w:type="spellEnd"/>
+      <w:r>
+        <w:rPr>
+          <w:rFonts w:ascii="Arial" w:hAnsi="Arial" w:cs="Arial"/>
+          <w:szCs w:val="22"/>
+        </w:rPr>
+        <w:t xml:space="preserve"> com o objetivo de permitir consultas flexíveis sobre os registros de movimentação armazenados no Data Warehouse.</w:t>
       </w:r>
     </w:p>
     <w:p>
@@ -23655,7 +24651,23 @@
           <w:rFonts w:ascii="Arial" w:hAnsi="Arial" w:cs="Arial"/>
           <w:szCs w:val="22"/>
         </w:rPr>
-        <w:t>Conforme os parâmetros informados pelo usuário, novas cláusulas são adicionadas à consulta por meio da função format(), permitindo a geração dinâmica do comando SQL.</w:t>
+        <w:t xml:space="preserve">Conforme os parâmetros informados pelo usuário, novas cláusulas são adicionadas à consulta por meio da função </w:t>
+      </w:r>
+      <w:proofErr w:type="spellStart"/>
+      <w:r>
+        <w:rPr>
+          <w:rFonts w:ascii="Arial" w:hAnsi="Arial" w:cs="Arial"/>
+          <w:szCs w:val="22"/>
+        </w:rPr>
+        <w:t>format</w:t>
+      </w:r>
+      <w:proofErr w:type="spellEnd"/>
+      <w:r>
+        <w:rPr>
+          <w:rFonts w:ascii="Arial" w:hAnsi="Arial" w:cs="Arial"/>
+          <w:szCs w:val="22"/>
+        </w:rPr>
+        <w:t>(), permitindo a geração dinâmica do comando SQL.</w:t>
       </w:r>
     </w:p>
     <w:p>
@@ -23697,8 +24709,9 @@
           <w:szCs w:val="22"/>
           <w:lang w:val="en-US"/>
         </w:rPr>
-        <w:t>OPEN p_curso</w:t>
-      </w:r>
+        <w:t xml:space="preserve">OPEN </w:t>
+      </w:r>
+      <w:proofErr w:type="spellStart"/>
       <w:r>
         <w:rPr>
           <w:rFonts w:ascii="Arial" w:hAnsi="Arial" w:cs="Arial"/>
@@ -23707,7 +24720,7 @@
           <w:szCs w:val="22"/>
           <w:lang w:val="en-US"/>
         </w:rPr>
-        <w:t>r</w:t>
+        <w:t>p_curso</w:t>
       </w:r>
       <w:r>
         <w:rPr>
@@ -23717,7 +24730,40 @@
           <w:szCs w:val="22"/>
           <w:lang w:val="en-US"/>
         </w:rPr>
-        <w:t xml:space="preserve"> FOR EXECUTE v_sql;</w:t>
+        <w:t>r</w:t>
+      </w:r>
+      <w:proofErr w:type="spellEnd"/>
+      <w:r>
+        <w:rPr>
+          <w:rFonts w:ascii="Arial" w:hAnsi="Arial" w:cs="Arial"/>
+          <w:i/>
+          <w:iCs/>
+          <w:szCs w:val="22"/>
+          <w:lang w:val="en-US"/>
+        </w:rPr>
+        <w:t xml:space="preserve"> FOR EXECUTE </w:t>
+      </w:r>
+      <w:proofErr w:type="spellStart"/>
+      <w:r>
+        <w:rPr>
+          <w:rFonts w:ascii="Arial" w:hAnsi="Arial" w:cs="Arial"/>
+          <w:i/>
+          <w:iCs/>
+          <w:szCs w:val="22"/>
+          <w:lang w:val="en-US"/>
+        </w:rPr>
+        <w:t>v_sql</w:t>
+      </w:r>
+      <w:proofErr w:type="spellEnd"/>
+      <w:r>
+        <w:rPr>
+          <w:rFonts w:ascii="Arial" w:hAnsi="Arial" w:cs="Arial"/>
+          <w:i/>
+          <w:iCs/>
+          <w:szCs w:val="22"/>
+          <w:lang w:val="en-US"/>
+        </w:rPr>
+        <w:t>;</w:t>
       </w:r>
     </w:p>
     <w:p>
@@ -23735,7 +24781,23 @@
           <w:rFonts w:ascii="Arial" w:hAnsi="Arial" w:cs="Arial"/>
           <w:szCs w:val="22"/>
         </w:rPr>
-        <w:t>A utilização do cursor permite que os registros sejam recuperados posteriormente pela aplicação Flask através do comando FETCH.</w:t>
+        <w:t xml:space="preserve">A utilização do cursor permite que os registros sejam recuperados posteriormente pela aplicação </w:t>
+      </w:r>
+      <w:proofErr w:type="spellStart"/>
+      <w:r>
+        <w:rPr>
+          <w:rFonts w:ascii="Arial" w:hAnsi="Arial" w:cs="Arial"/>
+          <w:szCs w:val="22"/>
+        </w:rPr>
+        <w:t>Flask</w:t>
+      </w:r>
+      <w:proofErr w:type="spellEnd"/>
+      <w:r>
+        <w:rPr>
+          <w:rFonts w:ascii="Arial" w:hAnsi="Arial" w:cs="Arial"/>
+          <w:szCs w:val="22"/>
+        </w:rPr>
+        <w:t xml:space="preserve"> através do comando FETCH.</w:t>
       </w:r>
     </w:p>
     <w:p>
@@ -23753,7 +24815,39 @@
           <w:rFonts w:ascii="Arial" w:hAnsi="Arial" w:cs="Arial"/>
           <w:szCs w:val="22"/>
         </w:rPr>
-        <w:t>A camada de aplicação foi desenvolvida em Flask e utiliza SQLAlchemy para comunicação com o banco de dados.</w:t>
+        <w:t xml:space="preserve">A camada de aplicação foi desenvolvida em </w:t>
+      </w:r>
+      <w:proofErr w:type="spellStart"/>
+      <w:r>
+        <w:rPr>
+          <w:rFonts w:ascii="Arial" w:hAnsi="Arial" w:cs="Arial"/>
+          <w:szCs w:val="22"/>
+        </w:rPr>
+        <w:t>Flask</w:t>
+      </w:r>
+      <w:proofErr w:type="spellEnd"/>
+      <w:r>
+        <w:rPr>
+          <w:rFonts w:ascii="Arial" w:hAnsi="Arial" w:cs="Arial"/>
+          <w:szCs w:val="22"/>
+        </w:rPr>
+        <w:t xml:space="preserve"> e utiliza </w:t>
+      </w:r>
+      <w:proofErr w:type="spellStart"/>
+      <w:r>
+        <w:rPr>
+          <w:rFonts w:ascii="Arial" w:hAnsi="Arial" w:cs="Arial"/>
+          <w:szCs w:val="22"/>
+        </w:rPr>
+        <w:t>SQLAlchemy</w:t>
+      </w:r>
+      <w:proofErr w:type="spellEnd"/>
+      <w:r>
+        <w:rPr>
+          <w:rFonts w:ascii="Arial" w:hAnsi="Arial" w:cs="Arial"/>
+          <w:szCs w:val="22"/>
+        </w:rPr>
+        <w:t xml:space="preserve"> para comunicação com o banco de dados.</w:t>
       </w:r>
     </w:p>
     <w:p>
@@ -23771,7 +24865,24 @@
           <w:rFonts w:ascii="Arial" w:hAnsi="Arial" w:cs="Arial"/>
           <w:szCs w:val="22"/>
         </w:rPr>
-        <w:t>Quando o usuário realiza uma pesquisa na interface, a aplicação executa a procedure por meio do comando CALL e posteriormente recupera os dados utilizando FETCH ALL FROM cursor_mov.</w:t>
+        <w:lastRenderedPageBreak/>
+        <w:t xml:space="preserve">Quando o usuário realiza uma pesquisa na interface, a aplicação executa a procedure por meio do comando CALL e posteriormente recupera os dados utilizando FETCH ALL FROM </w:t>
+      </w:r>
+      <w:proofErr w:type="spellStart"/>
+      <w:r>
+        <w:rPr>
+          <w:rFonts w:ascii="Arial" w:hAnsi="Arial" w:cs="Arial"/>
+          <w:szCs w:val="22"/>
+        </w:rPr>
+        <w:t>cursor_mov</w:t>
+      </w:r>
+      <w:proofErr w:type="spellEnd"/>
+      <w:r>
+        <w:rPr>
+          <w:rFonts w:ascii="Arial" w:hAnsi="Arial" w:cs="Arial"/>
+          <w:szCs w:val="22"/>
+        </w:rPr>
+        <w:t>.</w:t>
       </w:r>
     </w:p>
     <w:p>
@@ -23789,7 +24900,6 @@
           <w:rFonts w:ascii="Arial" w:hAnsi="Arial" w:cs="Arial"/>
           <w:szCs w:val="22"/>
         </w:rPr>
-        <w:lastRenderedPageBreak/>
         <w:t>Essa abordagem oferece uma separação adequada entre regras de acesso aos dados e lógica de apresentação.</w:t>
       </w:r>
     </w:p>
@@ -23962,7 +25072,23 @@
           <w:rFonts w:ascii="Arial" w:hAnsi="Arial" w:cs="Arial"/>
           <w:szCs w:val="22"/>
         </w:rPr>
-        <w:t>Além da procedure de consulta dinâmica, foi implementada a procedure sp_estatistica_produtos para atender ao requisito de geração de estatísticas relevantes para o domínio do projeto.</w:t>
+        <w:t xml:space="preserve">Além da procedure de consulta dinâmica, foi implementada a procedure </w:t>
+      </w:r>
+      <w:proofErr w:type="spellStart"/>
+      <w:r>
+        <w:rPr>
+          <w:rFonts w:ascii="Arial" w:hAnsi="Arial" w:cs="Arial"/>
+          <w:szCs w:val="22"/>
+        </w:rPr>
+        <w:t>sp_estatistica_produtos</w:t>
+      </w:r>
+      <w:proofErr w:type="spellEnd"/>
+      <w:r>
+        <w:rPr>
+          <w:rFonts w:ascii="Arial" w:hAnsi="Arial" w:cs="Arial"/>
+          <w:szCs w:val="22"/>
+        </w:rPr>
+        <w:t xml:space="preserve"> para atender ao requisito de geração de estatísticas relevantes para o domínio do projeto.</w:t>
       </w:r>
     </w:p>
     <w:p>
@@ -24198,6 +25324,7 @@
           <w:rFonts w:ascii="Arial" w:hAnsi="Arial" w:cs="Arial"/>
           <w:szCs w:val="22"/>
         </w:rPr>
+        <w:lastRenderedPageBreak/>
         <w:t>Avaliar desempenho comercial dos produtos.</w:t>
       </w:r>
     </w:p>
@@ -24255,14 +25382,15 @@
           <w:szCs w:val="22"/>
         </w:rPr>
       </w:pPr>
-      <w:r>
-        <w:rPr>
-          <w:rFonts w:ascii="Arial" w:hAnsi="Arial" w:cs="Arial"/>
-          <w:szCs w:val="22"/>
-        </w:rPr>
-        <w:lastRenderedPageBreak/>
+      <w:proofErr w:type="spellStart"/>
+      <w:r>
+        <w:rPr>
+          <w:rFonts w:ascii="Arial" w:hAnsi="Arial" w:cs="Arial"/>
+          <w:szCs w:val="22"/>
+        </w:rPr>
         <w:t>fato_movimentacao</w:t>
       </w:r>
+      <w:proofErr w:type="spellEnd"/>
     </w:p>
     <w:p>
       <w:pPr>
@@ -24278,6 +25406,7 @@
           <w:szCs w:val="22"/>
         </w:rPr>
       </w:pPr>
+      <w:proofErr w:type="spellStart"/>
       <w:r>
         <w:rPr>
           <w:rFonts w:ascii="Arial" w:hAnsi="Arial" w:cs="Arial"/>
@@ -24285,6 +25414,7 @@
         </w:rPr>
         <w:t>dim_produto</w:t>
       </w:r>
+      <w:proofErr w:type="spellEnd"/>
     </w:p>
     <w:p>
       <w:pPr>
@@ -24301,7 +25431,23 @@
           <w:rFonts w:ascii="Arial" w:hAnsi="Arial" w:cs="Arial"/>
           <w:szCs w:val="22"/>
         </w:rPr>
-        <w:t>A tabela fato_movimentacao fornece os dados quantitativos das operações, enquanto a dimensão de produtos permite a identificação e agrupamento dos resultados.</w:t>
+        <w:t xml:space="preserve">A tabela </w:t>
+      </w:r>
+      <w:proofErr w:type="spellStart"/>
+      <w:r>
+        <w:rPr>
+          <w:rFonts w:ascii="Arial" w:hAnsi="Arial" w:cs="Arial"/>
+          <w:szCs w:val="22"/>
+        </w:rPr>
+        <w:t>fato_movimentacao</w:t>
+      </w:r>
+      <w:proofErr w:type="spellEnd"/>
+      <w:r>
+        <w:rPr>
+          <w:rFonts w:ascii="Arial" w:hAnsi="Arial" w:cs="Arial"/>
+          <w:szCs w:val="22"/>
+        </w:rPr>
+        <w:t xml:space="preserve"> fornece os dados quantitativos das operações, enquanto a dimensão de produtos permite a identificação e agrupamento dos resultados.</w:t>
       </w:r>
     </w:p>
     <w:p>
@@ -24332,7 +25478,23 @@
           <w:rFonts w:ascii="Arial" w:hAnsi="Arial" w:cs="Arial"/>
           <w:szCs w:val="22"/>
         </w:rPr>
-        <w:t>Foi implementado um mecanismo de auditoria automática por meio de Trigger para registrar eventos de inserção na tabela fato_movimentacao.</w:t>
+        <w:t xml:space="preserve">Foi implementado um mecanismo de auditoria automática por meio de Trigger para registrar eventos de inserção na tabela </w:t>
+      </w:r>
+      <w:proofErr w:type="spellStart"/>
+      <w:r>
+        <w:rPr>
+          <w:rFonts w:ascii="Arial" w:hAnsi="Arial" w:cs="Arial"/>
+          <w:szCs w:val="22"/>
+        </w:rPr>
+        <w:t>fato_movimentacao</w:t>
+      </w:r>
+      <w:proofErr w:type="spellEnd"/>
+      <w:r>
+        <w:rPr>
+          <w:rFonts w:ascii="Arial" w:hAnsi="Arial" w:cs="Arial"/>
+          <w:szCs w:val="22"/>
+        </w:rPr>
+        <w:t>.</w:t>
       </w:r>
     </w:p>
     <w:p>
@@ -24350,7 +25512,23 @@
           <w:rFonts w:ascii="Arial" w:hAnsi="Arial" w:cs="Arial"/>
           <w:szCs w:val="22"/>
         </w:rPr>
-        <w:t>Foi criada a tabela log_movimentacao, destinada ao armazenamento dos registros de auditoria.</w:t>
+        <w:t xml:space="preserve">Foi criada a tabela </w:t>
+      </w:r>
+      <w:proofErr w:type="spellStart"/>
+      <w:r>
+        <w:rPr>
+          <w:rFonts w:ascii="Arial" w:hAnsi="Arial" w:cs="Arial"/>
+          <w:szCs w:val="22"/>
+        </w:rPr>
+        <w:t>log_movimentacao</w:t>
+      </w:r>
+      <w:proofErr w:type="spellEnd"/>
+      <w:r>
+        <w:rPr>
+          <w:rFonts w:ascii="Arial" w:hAnsi="Arial" w:cs="Arial"/>
+          <w:szCs w:val="22"/>
+        </w:rPr>
+        <w:t>, destinada ao armazenamento dos registros de auditoria.</w:t>
       </w:r>
     </w:p>
     <w:p>
@@ -24470,7 +25648,23 @@
           <w:rFonts w:ascii="Arial" w:hAnsi="Arial" w:cs="Arial"/>
           <w:szCs w:val="22"/>
         </w:rPr>
-        <w:t>A trigger utiliza a função fn_log_movimentacao.</w:t>
+        <w:t xml:space="preserve">A trigger utiliza a função </w:t>
+      </w:r>
+      <w:proofErr w:type="spellStart"/>
+      <w:r>
+        <w:rPr>
+          <w:rFonts w:ascii="Arial" w:hAnsi="Arial" w:cs="Arial"/>
+          <w:szCs w:val="22"/>
+        </w:rPr>
+        <w:t>fn_log_movimentacao</w:t>
+      </w:r>
+      <w:proofErr w:type="spellEnd"/>
+      <w:r>
+        <w:rPr>
+          <w:rFonts w:ascii="Arial" w:hAnsi="Arial" w:cs="Arial"/>
+          <w:szCs w:val="22"/>
+        </w:rPr>
+        <w:t>.</w:t>
       </w:r>
     </w:p>
     <w:p>
@@ -24488,7 +25682,23 @@
           <w:rFonts w:ascii="Arial" w:hAnsi="Arial" w:cs="Arial"/>
           <w:szCs w:val="22"/>
         </w:rPr>
-        <w:t>Sempre que uma nova movimentação é inserida na tabela fato_movimentacao, a função é executada automaticamente e grava os dados correspondentes na tabela de log.</w:t>
+        <w:t xml:space="preserve">Sempre que uma nova movimentação é inserida na tabela </w:t>
+      </w:r>
+      <w:proofErr w:type="spellStart"/>
+      <w:r>
+        <w:rPr>
+          <w:rFonts w:ascii="Arial" w:hAnsi="Arial" w:cs="Arial"/>
+          <w:szCs w:val="22"/>
+        </w:rPr>
+        <w:t>fato_movimentacao</w:t>
+      </w:r>
+      <w:proofErr w:type="spellEnd"/>
+      <w:r>
+        <w:rPr>
+          <w:rFonts w:ascii="Arial" w:hAnsi="Arial" w:cs="Arial"/>
+          <w:szCs w:val="22"/>
+        </w:rPr>
+        <w:t>, a função é executada automaticamente e grava os dados correspondentes na tabela de log.</w:t>
       </w:r>
     </w:p>
     <w:p>
@@ -24643,6 +25853,7 @@
       </w:pPr>
       <w:bookmarkStart w:id="47" w:name="_Toc231652388"/>
       <w:r>
+        <w:lastRenderedPageBreak/>
         <w:t>10.5</w:t>
       </w:r>
       <w:r>
@@ -24686,8 +25897,23 @@
           <w:rFonts w:ascii="Arial" w:hAnsi="Arial" w:cs="Arial"/>
           <w:szCs w:val="22"/>
         </w:rPr>
-        <w:lastRenderedPageBreak/>
-        <w:t>A utilização de uma Stored Procedure com cursor e SQL dinâmica permitiu a construção de consultas flexíveis e reutilizáveis, enquanto a implementação de uma procedure estatística agregou capacidade analítica ao sistema.</w:t>
+        <w:t xml:space="preserve">A utilização de uma </w:t>
+      </w:r>
+      <w:proofErr w:type="spellStart"/>
+      <w:r>
+        <w:rPr>
+          <w:rFonts w:ascii="Arial" w:hAnsi="Arial" w:cs="Arial"/>
+          <w:szCs w:val="22"/>
+        </w:rPr>
+        <w:t>Stored</w:t>
+      </w:r>
+      <w:proofErr w:type="spellEnd"/>
+      <w:r>
+        <w:rPr>
+          <w:rFonts w:ascii="Arial" w:hAnsi="Arial" w:cs="Arial"/>
+          <w:szCs w:val="22"/>
+        </w:rPr>
+        <w:t xml:space="preserve"> Procedure com cursor e SQL dinâmica permitiu a construção de consultas flexíveis e reutilizáveis, enquanto a implementação de uma procedure estatística agregou capacidade analítica ao sistema.</w:t>
       </w:r>
     </w:p>
     <w:p>
@@ -24723,7 +25949,23 @@
           <w:rFonts w:ascii="Arial" w:hAnsi="Arial" w:cs="Arial"/>
           <w:szCs w:val="22"/>
         </w:rPr>
-        <w:t>As soluções implementadas atenderam integralmente aos requisitos propostos, mantendo a integração com a aplicação Flask sem necessidade de alterações estruturais em seu funcionamento, preservando a arquitetura existente e ampliando suas capacidades analíticas e de controle.</w:t>
+        <w:t xml:space="preserve">As soluções implementadas atenderam integralmente aos requisitos propostos, mantendo a integração com a aplicação </w:t>
+      </w:r>
+      <w:proofErr w:type="spellStart"/>
+      <w:r>
+        <w:rPr>
+          <w:rFonts w:ascii="Arial" w:hAnsi="Arial" w:cs="Arial"/>
+          <w:szCs w:val="22"/>
+        </w:rPr>
+        <w:t>Flask</w:t>
+      </w:r>
+      <w:proofErr w:type="spellEnd"/>
+      <w:r>
+        <w:rPr>
+          <w:rFonts w:ascii="Arial" w:hAnsi="Arial" w:cs="Arial"/>
+          <w:szCs w:val="22"/>
+        </w:rPr>
+        <w:t xml:space="preserve"> sem necessidade de alterações estruturais em seu funcionamento, preservando a arquitetura existente e ampliando suas capacidades analíticas e de controle.</w:t>
       </w:r>
     </w:p>
     <w:p>
@@ -24800,7 +26042,16 @@
           <w:iCs/>
           <w:szCs w:val="22"/>
         </w:rPr>
-        <w:t>As análises desenvolvidas demonstraram a importância da integração entre tecnologia e estratégia empresarial. A utilização do banco de dados relacional possibilitou a estruturação das informações operacionais, enquanto os processos ETL permitiram o tratamento e a transformação dos dados para fins analíticos. O Data Warehouse, por sua vez, contribuiu para a consolidação das informações históricas, permitindo uma visão mais ampla sobre as movimentações de estoque e o comportamento das vendas. Já os dashboards ofereceram uma forma mais clara e objetiva de visualizar indicadores relevantes, facilitando a interpretação dos resultados pelos gestores.</w:t>
+        <w:t xml:space="preserve">As análises desenvolvidas demonstraram a importância da integração entre tecnologia e estratégia empresarial. A utilização do banco de dados relacional possibilitou a estruturação das informações operacionais, enquanto os processos ETL permitiram o tratamento e a transformação dos dados para fins analíticos. O Data Warehouse, por sua vez, contribuiu para a consolidação das informações históricas, permitindo uma visão mais ampla sobre as movimentações de estoque e o </w:t>
+      </w:r>
+      <w:r>
+        <w:rPr>
+          <w:rFonts w:ascii="Arial" w:hAnsi="Arial" w:cs="Arial"/>
+          <w:iCs/>
+          <w:szCs w:val="22"/>
+        </w:rPr>
+        <w:lastRenderedPageBreak/>
+        <w:t>comportamento das vendas. Já os dashboards ofereceram uma forma mais clara e objetiva de visualizar indicadores relevantes, facilitando a interpretação dos resultados pelos gestores.</w:t>
       </w:r>
     </w:p>
     <w:p>
@@ -24820,16 +26071,7 @@
           <w:iCs/>
           <w:szCs w:val="22"/>
         </w:rPr>
-        <w:t xml:space="preserve">No campo estatístico, a escolha da variável preço de venda permitiu avaliar o comportamento econômico das movimentações de saída da empresa. A aplicação de técnicas de inferência estatística </w:t>
-      </w:r>
-      <w:r>
-        <w:rPr>
-          <w:rFonts w:ascii="Arial" w:hAnsi="Arial" w:cs="Arial"/>
-          <w:iCs/>
-          <w:szCs w:val="22"/>
-        </w:rPr>
-        <w:lastRenderedPageBreak/>
-        <w:t>demonstrou que a amostra selecionada foi representativa em relação à população analisada, reforçando a confiabilidade dos resultados obtidos. Além disso, o intervalo de confiança e o teste de hipótese contribuíram para validar estatisticamente a análise, evidenciando como métodos quantitativos podem apoiar decisões relacionadas à gestão de estoque, planejamento comercial e acompanhamento financeiro.</w:t>
+        <w:t>No campo estatístico, a escolha da variável preço de venda permitiu avaliar o comportamento econômico das movimentações de saída da empresa. A aplicação de técnicas de inferência estatística demonstrou que a amostra selecionada foi representativa em relação à população analisada, reforçando a confiabilidade dos resultados obtidos. Além disso, o intervalo de confiança e o teste de hipótese contribuíram para validar estatisticamente a análise, evidenciando como métodos quantitativos podem apoiar decisões relacionadas à gestão de estoque, planejamento comercial e acompanhamento financeiro.</w:t>
       </w:r>
     </w:p>
     <w:p>
@@ -24909,7 +26151,16 @@
           <w:iCs/>
           <w:szCs w:val="22"/>
         </w:rPr>
-        <w:t>A gestão de projetos teve papel fundamental na organização das etapas desenvolvidas, permitindo o planejamento das atividades, a estimativa de custos, a identificação de riscos e o monitoramento das entregas. A elaboração dos artefatos de gerenciamento contribuiu para uma visão mais estruturada do projeto, reduzindo incertezas e fortalecendo a capacidade de execução da equipe.</w:t>
+        <w:t xml:space="preserve">A gestão de projetos teve papel fundamental na organização das etapas desenvolvidas, permitindo o planejamento das atividades, a estimativa de custos, a identificação de riscos e o </w:t>
+      </w:r>
+      <w:r>
+        <w:rPr>
+          <w:rFonts w:ascii="Arial" w:hAnsi="Arial" w:cs="Arial"/>
+          <w:iCs/>
+          <w:szCs w:val="22"/>
+        </w:rPr>
+        <w:lastRenderedPageBreak/>
+        <w:t>monitoramento das entregas. A elaboração dos artefatos de gerenciamento contribuiu para uma visão mais estruturada do projeto, reduzindo incertezas e fortalecendo a capacidade de execução da equipe.</w:t>
       </w:r>
     </w:p>
     <w:p>
@@ -24929,16 +26180,7 @@
           <w:iCs/>
           <w:szCs w:val="22"/>
         </w:rPr>
-        <w:t xml:space="preserve">Dessa forma, conclui-se que o Projeto Integrador III atingiu seus objetivos ao propor uma solução informatizada capaz de apoiar a gestão operacional e estratégica da MFIX Fixadores. A integração entre sistema, banco de dados, análise estatística, inteligência artificial e visualização de </w:t>
-      </w:r>
-      <w:r>
-        <w:rPr>
-          <w:rFonts w:ascii="Arial" w:hAnsi="Arial" w:cs="Arial"/>
-          <w:iCs/>
-          <w:szCs w:val="22"/>
-        </w:rPr>
-        <w:lastRenderedPageBreak/>
-        <w:t>indicadores representa um avanço significativo para o controle de estoque e para a tomada de decisão baseada em dados.</w:t>
+        <w:t>Dessa forma, conclui-se que o Projeto Integrador III atingiu seus objetivos ao propor uma solução informatizada capaz de apoiar a gestão operacional e estratégica da MFIX Fixadores. A integração entre sistema, banco de dados, análise estatística, inteligência artificial e visualização de indicadores representa um avanço significativo para o controle de estoque e para a tomada de decisão baseada em dados.</w:t>
       </w:r>
     </w:p>
     <w:p>
@@ -25136,6 +26378,7 @@
           <w:iCs/>
           <w:szCs w:val="22"/>
         </w:rPr>
+        <w:lastRenderedPageBreak/>
         <w:t>FATEC IPIRANGA “PASTOR ENÉAS TOGNINI”. Material didático da disciplina de Programação em Banco de Dados I. São Paulo: Fatec Ipiranga, 2026.</w:t>
       </w:r>
     </w:p>
@@ -25194,7 +26437,25 @@
           <w:iCs/>
           <w:szCs w:val="22"/>
         </w:rPr>
-        <w:t xml:space="preserve">GIL, Antonio Carlos. </w:t>
+        <w:t xml:space="preserve">GIL, </w:t>
+      </w:r>
+      <w:proofErr w:type="spellStart"/>
+      <w:r>
+        <w:rPr>
+          <w:rFonts w:ascii="Arial" w:hAnsi="Arial" w:cs="Arial"/>
+          <w:iCs/>
+          <w:szCs w:val="22"/>
+        </w:rPr>
+        <w:t>Antonio</w:t>
+      </w:r>
+      <w:proofErr w:type="spellEnd"/>
+      <w:r>
+        <w:rPr>
+          <w:rFonts w:ascii="Arial" w:hAnsi="Arial" w:cs="Arial"/>
+          <w:iCs/>
+          <w:szCs w:val="22"/>
+        </w:rPr>
+        <w:t xml:space="preserve"> Carlos. </w:t>
       </w:r>
       <w:r>
         <w:rPr>
@@ -25241,7 +26502,6 @@
           <w:szCs w:val="22"/>
           <w:lang w:val="en-US"/>
         </w:rPr>
-        <w:lastRenderedPageBreak/>
         <w:t xml:space="preserve">MCKINNEY, Wes. </w:t>
       </w:r>
       <w:r>
@@ -25252,8 +26512,20 @@
           <w:szCs w:val="22"/>
           <w:lang w:val="en-US"/>
         </w:rPr>
-        <w:t>Python for Data Analysis: data wrangling with pandas, NumPy, and Jupyter</w:t>
-      </w:r>
+        <w:t xml:space="preserve">Python for Data Analysis: data wrangling with pandas, NumPy, and </w:t>
+      </w:r>
+      <w:proofErr w:type="spellStart"/>
+      <w:r>
+        <w:rPr>
+          <w:rFonts w:ascii="Arial" w:hAnsi="Arial" w:cs="Arial"/>
+          <w:i/>
+          <w:iCs/>
+          <w:szCs w:val="22"/>
+          <w:lang w:val="en-US"/>
+        </w:rPr>
+        <w:t>Jupyter</w:t>
+      </w:r>
+      <w:proofErr w:type="spellEnd"/>
       <w:r>
         <w:rPr>
           <w:rFonts w:ascii="Arial" w:hAnsi="Arial" w:cs="Arial"/>
@@ -25335,8 +26607,19 @@
           <w:iCs/>
           <w:szCs w:val="22"/>
         </w:rPr>
-        <w:t>PostgreSQL Documentation</w:t>
-      </w:r>
+        <w:t xml:space="preserve">PostgreSQL </w:t>
+      </w:r>
+      <w:proofErr w:type="spellStart"/>
+      <w:r>
+        <w:rPr>
+          <w:rFonts w:ascii="Arial" w:hAnsi="Arial" w:cs="Arial"/>
+          <w:i/>
+          <w:iCs/>
+          <w:szCs w:val="22"/>
+        </w:rPr>
+        <w:t>Documentation</w:t>
+      </w:r>
+      <w:proofErr w:type="spellEnd"/>
       <w:r>
         <w:rPr>
           <w:rFonts w:ascii="Arial" w:hAnsi="Arial" w:cs="Arial"/>
@@ -25479,6 +26762,7 @@
         </w:rPr>
         <w:t xml:space="preserve">. </w:t>
       </w:r>
+      <w:proofErr w:type="spellStart"/>
       <w:r>
         <w:rPr>
           <w:rFonts w:ascii="Arial" w:hAnsi="Arial" w:cs="Arial"/>
@@ -25486,7 +26770,37 @@
           <w:szCs w:val="22"/>
           <w:lang w:val="en-US"/>
         </w:rPr>
-        <w:t>Acesso em: 06 jun. 2026.</w:t>
+        <w:t>Acesso</w:t>
+      </w:r>
+      <w:proofErr w:type="spellEnd"/>
+      <w:r>
+        <w:rPr>
+          <w:rFonts w:ascii="Arial" w:hAnsi="Arial" w:cs="Arial"/>
+          <w:iCs/>
+          <w:szCs w:val="22"/>
+          <w:lang w:val="en-US"/>
+        </w:rPr>
+        <w:t xml:space="preserve"> </w:t>
+      </w:r>
+      <w:proofErr w:type="spellStart"/>
+      <w:r>
+        <w:rPr>
+          <w:rFonts w:ascii="Arial" w:hAnsi="Arial" w:cs="Arial"/>
+          <w:iCs/>
+          <w:szCs w:val="22"/>
+          <w:lang w:val="en-US"/>
+        </w:rPr>
+        <w:t>em</w:t>
+      </w:r>
+      <w:proofErr w:type="spellEnd"/>
+      <w:r>
+        <w:rPr>
+          <w:rFonts w:ascii="Arial" w:hAnsi="Arial" w:cs="Arial"/>
+          <w:iCs/>
+          <w:szCs w:val="22"/>
+          <w:lang w:val="en-US"/>
+        </w:rPr>
+        <w:t>: 06 jun. 2026.</w:t>
       </w:r>
     </w:p>
     <w:p>
@@ -25584,7 +26898,29 @@
           <w:szCs w:val="22"/>
           <w:lang w:val="en-US"/>
         </w:rPr>
-        <w:t>Scikit-learn: machine learning in Python</w:t>
+        <w:t>Scikit-</w:t>
+      </w:r>
+      <w:proofErr w:type="gramStart"/>
+      <w:r>
+        <w:rPr>
+          <w:rFonts w:ascii="Arial" w:hAnsi="Arial" w:cs="Arial"/>
+          <w:i/>
+          <w:iCs/>
+          <w:szCs w:val="22"/>
+          <w:lang w:val="en-US"/>
+        </w:rPr>
+        <w:t>learn:</w:t>
+      </w:r>
+      <w:proofErr w:type="gramEnd"/>
+      <w:r>
+        <w:rPr>
+          <w:rFonts w:ascii="Arial" w:hAnsi="Arial" w:cs="Arial"/>
+          <w:i/>
+          <w:iCs/>
+          <w:szCs w:val="22"/>
+          <w:lang w:val="en-US"/>
+        </w:rPr>
+        <w:t xml:space="preserve"> machine learning in Python</w:t>
       </w:r>
       <w:r>
         <w:rPr>
@@ -25704,7 +27040,27 @@
           <w:szCs w:val="22"/>
           <w:lang w:val="en-US"/>
         </w:rPr>
-        <w:t>São Paulo: Pioneira, 2000.</w:t>
+        <w:t xml:space="preserve">São Paulo: </w:t>
+      </w:r>
+      <w:proofErr w:type="spellStart"/>
+      <w:r>
+        <w:rPr>
+          <w:rFonts w:ascii="Arial" w:hAnsi="Arial" w:cs="Arial"/>
+          <w:iCs/>
+          <w:szCs w:val="22"/>
+          <w:lang w:val="en-US"/>
+        </w:rPr>
+        <w:t>Pioneira</w:t>
+      </w:r>
+      <w:proofErr w:type="spellEnd"/>
+      <w:r>
+        <w:rPr>
+          <w:rFonts w:ascii="Arial" w:hAnsi="Arial" w:cs="Arial"/>
+          <w:iCs/>
+          <w:szCs w:val="22"/>
+          <w:lang w:val="en-US"/>
+        </w:rPr>
+        <w:t>, 2000.</w:t>
       </w:r>
     </w:p>
     <w:p>
@@ -26156,7 +27512,39 @@
               <w:rFonts w:ascii="Times New Roman" w:eastAsia="Times New Roman" w:hAnsi="Times New Roman" w:cs="Times New Roman"/>
               <w:sz w:val="20"/>
             </w:rPr>
-            <w:t xml:space="preserve">  Data:  &lt;dd/mmm/aa&gt; </w:t>
+            <w:t xml:space="preserve">  Data:  &lt;</w:t>
+          </w:r>
+          <w:proofErr w:type="spellStart"/>
+          <w:r>
+            <w:rPr>
+              <w:rFonts w:ascii="Times New Roman" w:eastAsia="Times New Roman" w:hAnsi="Times New Roman" w:cs="Times New Roman"/>
+              <w:sz w:val="20"/>
+            </w:rPr>
+            <w:t>dd</w:t>
+          </w:r>
+          <w:proofErr w:type="spellEnd"/>
+          <w:r>
+            <w:rPr>
+              <w:rFonts w:ascii="Times New Roman" w:eastAsia="Times New Roman" w:hAnsi="Times New Roman" w:cs="Times New Roman"/>
+              <w:sz w:val="20"/>
+            </w:rPr>
+            <w:t>/</w:t>
+          </w:r>
+          <w:proofErr w:type="spellStart"/>
+          <w:r>
+            <w:rPr>
+              <w:rFonts w:ascii="Times New Roman" w:eastAsia="Times New Roman" w:hAnsi="Times New Roman" w:cs="Times New Roman"/>
+              <w:sz w:val="20"/>
+            </w:rPr>
+            <w:t>mmm</w:t>
+          </w:r>
+          <w:proofErr w:type="spellEnd"/>
+          <w:r>
+            <w:rPr>
+              <w:rFonts w:ascii="Times New Roman" w:eastAsia="Times New Roman" w:hAnsi="Times New Roman" w:cs="Times New Roman"/>
+              <w:sz w:val="20"/>
+            </w:rPr>
+            <w:t xml:space="preserve">/aa&gt; </w:t>
           </w:r>
         </w:p>
       </w:tc>
@@ -31915,7 +33303,7 @@
     <w:autoRedefine/>
     <w:uiPriority w:val="9"/>
     <w:qFormat/>
-    <w:rsid w:val="00722521"/>
+    <w:rsid w:val="00CC00AE"/>
     <w:pPr>
       <w:spacing w:before="120" w:after="360" w:line="240" w:lineRule="auto"/>
       <w:outlineLvl w:val="0"/>
@@ -31927,6 +33315,7 @@
       <w:iCs/>
       <w:caps/>
       <w:color w:val="000000" w:themeColor="text1"/>
+      <w:sz w:val="28"/>
       <w:szCs w:val="22"/>
     </w:rPr>
   </w:style>
@@ -32046,7 +33435,7 @@
     <w:name w:val="Título 1 Char"/>
     <w:link w:val="Ttulo1"/>
     <w:uiPriority w:val="9"/>
-    <w:rsid w:val="00722521"/>
+    <w:rsid w:val="00CC00AE"/>
     <w:rPr>
       <w:rFonts w:ascii="Arial" w:eastAsia="Times New Roman" w:hAnsi="Arial" w:cs="Arial"/>
       <w:b/>
@@ -32054,6 +33443,7 @@
       <w:iCs/>
       <w:caps/>
       <w:color w:val="000000" w:themeColor="text1"/>
+      <w:sz w:val="28"/>
       <w:szCs w:val="22"/>
     </w:rPr>
   </w:style>

</xml_diff>